<commit_message>
Add weighted scoring and UI for Document 6
Implement weighted scoring for Document 6 (teacher evaluation):

- Server: AcademicAdminController now computes section scores and grand total for type==6 using weights [20,30,30,20], formats scores, and sets evaluation check values (ch1..ch4).
- Client/UI: document_form.html updated with inputs for 4 sections (re1..re4), per-section weighted score fields, grand total display, and evaluation checkboxes. Added JS to auto-calculate weighted scores, update grand total, and auto-select the appropriate evaluation level.
- Added picture assets (picdoc/*.png) and updated DOCX templates (templates/docx/*). Removed temporary ~ files.
- Built/compiled artifacts and target metadata updated.

This ties server-side and client-side logic to ensure consistent scoring and evaluation state when saving or rendering Document 6.
</commit_message>
<xml_diff>
--- a/shopping-cart-spring-boot-main/src/main/resources/templates/docx/doc_6.docx
+++ b/shopping-cart-spring-boot-main/src/main/resources/templates/docx/doc_6.docx
@@ -186,7 +186,7 @@
           <w:tab w:val="left" w:pos="4820"/>
         </w:tabs>
         <w:rPr>
-          <w:rFonts w:ascii="TH Sarabun New" w:hAnsi="TH Sarabun New" w:cs="TH Sarabun New" w:hint="cs"/>
+          <w:rFonts w:ascii="TH Sarabun New" w:hAnsi="TH Sarabun New" w:cs="TH Sarabun New"/>
           <w:sz w:val="24"/>
           <w:szCs w:val="24"/>
         </w:rPr>
@@ -1185,15 +1185,427 @@
                 <w:sz w:val="24"/>
                 <w:szCs w:val="24"/>
               </w:rPr>
-              <w:t>{{score1</w:t>
-            </w:r>
-            <w:r>
-              <w:rPr>
-                <w:rFonts w:ascii="TH Sarabun New" w:hAnsi="TH Sarabun New" w:cs="TH Sarabun New"/>
-                <w:sz w:val="24"/>
-                <w:szCs w:val="24"/>
-              </w:rPr>
-              <w:t>2</w:t>
+              <w:t>{{score12}}</w:t>
+            </w:r>
+          </w:p>
+        </w:tc>
+        <w:tc>
+          <w:tcPr>
+            <w:tcW w:w="567" w:type="dxa"/>
+          </w:tcPr>
+          <w:p>
+            <w:pPr>
+              <w:spacing w:after="0"/>
+              <w:rPr>
+                <w:rFonts w:ascii="TH Sarabun New" w:hAnsi="TH Sarabun New" w:cs="TH Sarabun New"/>
+                <w:sz w:val="24"/>
+                <w:szCs w:val="24"/>
+                <w:cs/>
+              </w:rPr>
+            </w:pPr>
+            <w:r>
+              <w:rPr>
+                <w:rFonts w:ascii="TH Sarabun New" w:hAnsi="TH Sarabun New" w:cs="TH Sarabun New"/>
+                <w:sz w:val="24"/>
+                <w:szCs w:val="24"/>
+              </w:rPr>
+              <w:t>{{score13}}</w:t>
+            </w:r>
+          </w:p>
+        </w:tc>
+        <w:tc>
+          <w:tcPr>
+            <w:tcW w:w="567" w:type="dxa"/>
+          </w:tcPr>
+          <w:p>
+            <w:pPr>
+              <w:spacing w:after="0"/>
+              <w:rPr>
+                <w:rFonts w:ascii="TH Sarabun New" w:hAnsi="TH Sarabun New" w:cs="TH Sarabun New"/>
+                <w:sz w:val="24"/>
+                <w:szCs w:val="24"/>
+                <w:cs/>
+              </w:rPr>
+            </w:pPr>
+            <w:r>
+              <w:rPr>
+                <w:rFonts w:ascii="TH Sarabun New" w:hAnsi="TH Sarabun New" w:cs="TH Sarabun New"/>
+                <w:sz w:val="24"/>
+                <w:szCs w:val="24"/>
+              </w:rPr>
+              <w:t>{{score14}}</w:t>
+            </w:r>
+          </w:p>
+        </w:tc>
+        <w:tc>
+          <w:tcPr>
+            <w:tcW w:w="567" w:type="dxa"/>
+          </w:tcPr>
+          <w:p>
+            <w:pPr>
+              <w:spacing w:after="0"/>
+              <w:rPr>
+                <w:rFonts w:ascii="TH Sarabun New" w:hAnsi="TH Sarabun New" w:cs="TH Sarabun New"/>
+                <w:sz w:val="24"/>
+                <w:szCs w:val="24"/>
+                <w:cs/>
+              </w:rPr>
+            </w:pPr>
+            <w:r>
+              <w:rPr>
+                <w:rFonts w:ascii="TH Sarabun New" w:hAnsi="TH Sarabun New" w:cs="TH Sarabun New"/>
+                <w:sz w:val="24"/>
+                <w:szCs w:val="24"/>
+              </w:rPr>
+              <w:t>{{score15}}</w:t>
+            </w:r>
+          </w:p>
+        </w:tc>
+        <w:tc>
+          <w:tcPr>
+            <w:tcW w:w="850" w:type="dxa"/>
+          </w:tcPr>
+          <w:p>
+            <w:pPr>
+              <w:spacing w:after="0"/>
+              <w:jc w:val="center"/>
+              <w:rPr>
+                <w:rFonts w:ascii="TH Sarabun New" w:hAnsi="TH Sarabun New" w:cs="TH Sarabun New"/>
+                <w:sz w:val="24"/>
+                <w:szCs w:val="24"/>
+                <w:cs/>
+              </w:rPr>
+            </w:pPr>
+            <w:r>
+              <w:rPr>
+                <w:rFonts w:ascii="TH Sarabun New" w:hAnsi="TH Sarabun New" w:cs="TH Sarabun New"/>
+                <w:sz w:val="24"/>
+                <w:szCs w:val="24"/>
+                <w:cs/>
+              </w:rPr>
+              <w:t>๒๐</w:t>
+            </w:r>
+          </w:p>
+        </w:tc>
+        <w:tc>
+          <w:tcPr>
+            <w:tcW w:w="704" w:type="dxa"/>
+          </w:tcPr>
+          <w:p>
+            <w:pPr>
+              <w:spacing w:after="0"/>
+              <w:jc w:val="center"/>
+              <w:rPr>
+                <w:rFonts w:ascii="TH Sarabun New" w:hAnsi="TH Sarabun New" w:cs="TH Sarabun New"/>
+                <w:sz w:val="24"/>
+                <w:szCs w:val="24"/>
+                <w:cs/>
+              </w:rPr>
+            </w:pPr>
+            <w:r>
+              <w:rPr>
+                <w:rFonts w:ascii="TH Sarabun New" w:hAnsi="TH Sarabun New" w:cs="TH Sarabun New"/>
+                <w:sz w:val="24"/>
+                <w:szCs w:val="24"/>
+              </w:rPr>
+              <w:t>{{score1x}}</w:t>
+            </w:r>
+          </w:p>
+        </w:tc>
+        <w:tc>
+          <w:tcPr>
+            <w:tcW w:w="1701" w:type="dxa"/>
+          </w:tcPr>
+          <w:p>
+            <w:pPr>
+              <w:spacing w:after="0"/>
+              <w:rPr>
+                <w:rFonts w:ascii="TH Sarabun New" w:hAnsi="TH Sarabun New" w:cs="TH Sarabun New"/>
+                <w:sz w:val="20"/>
+                <w:szCs w:val="20"/>
+                <w:cs/>
+              </w:rPr>
+            </w:pPr>
+            <w:r>
+              <w:rPr>
+                <w:rFonts w:ascii="TH Sarabun New" w:hAnsi="TH Sarabun New" w:cs="TH Sarabun New"/>
+                <w:sz w:val="20"/>
+                <w:szCs w:val="20"/>
+                <w:cs/>
+              </w:rPr>
+              <w:t>-เอกสารหลักฐานตามข้อ ๘.๑ ของประกาศมหาวิทยาลัย</w:t>
+            </w:r>
+          </w:p>
+        </w:tc>
+      </w:tr>
+      <w:tr>
+        <w:trPr>
+          <w:trHeight w:val="4175"/>
+          <w:jc w:val="center"/>
+        </w:trPr>
+        <w:tc>
+          <w:tcPr>
+            <w:tcW w:w="421" w:type="dxa"/>
+          </w:tcPr>
+          <w:p>
+            <w:pPr>
+              <w:spacing w:after="0"/>
+              <w:jc w:val="center"/>
+              <w:rPr>
+                <w:rFonts w:ascii="TH Sarabun New" w:hAnsi="TH Sarabun New" w:cs="TH Sarabun New"/>
+                <w:sz w:val="24"/>
+                <w:szCs w:val="24"/>
+                <w:cs/>
+              </w:rPr>
+            </w:pPr>
+            <w:r>
+              <w:rPr>
+                <w:rFonts w:ascii="TH Sarabun New" w:hAnsi="TH Sarabun New" w:cs="TH Sarabun New"/>
+                <w:sz w:val="24"/>
+                <w:szCs w:val="24"/>
+                <w:cs/>
+              </w:rPr>
+              <w:t>๒</w:t>
+            </w:r>
+          </w:p>
+        </w:tc>
+        <w:tc>
+          <w:tcPr>
+            <w:tcW w:w="4541" w:type="dxa"/>
+          </w:tcPr>
+          <w:p>
+            <w:pPr>
+              <w:spacing w:after="0"/>
+              <w:rPr>
+                <w:rFonts w:ascii="TH Sarabun New" w:hAnsi="TH Sarabun New" w:cs="TH Sarabun New"/>
+                <w:sz w:val="24"/>
+                <w:szCs w:val="24"/>
+              </w:rPr>
+            </w:pPr>
+            <w:r>
+              <w:rPr>
+                <w:rFonts w:ascii="TH Sarabun New" w:hAnsi="TH Sarabun New" w:cs="TH Sarabun New"/>
+                <w:b/>
+                <w:bCs/>
+                <w:sz w:val="24"/>
+                <w:szCs w:val="24"/>
+                <w:cs/>
+              </w:rPr>
+              <w:t>ความสามารถด้านการวางแผนการสอนและการประเมินผลการเรียนการสอน</w:t>
+            </w:r>
+            <w:r>
+              <w:rPr>
+                <w:rFonts w:ascii="TH Sarabun New" w:hAnsi="TH Sarabun New" w:cs="TH Sarabun New"/>
+                <w:sz w:val="24"/>
+                <w:szCs w:val="24"/>
+                <w:cs/>
+              </w:rPr>
+              <w:t xml:space="preserve"> (ให้คูณระดับประเมินที่ได้ด้วย ๖)</w:t>
+            </w:r>
+          </w:p>
+          <w:p>
+            <w:pPr>
+              <w:spacing w:after="0"/>
+              <w:jc w:val="thaiDistribute"/>
+              <w:rPr>
+                <w:rFonts w:ascii="TH Sarabun New" w:hAnsi="TH Sarabun New" w:cs="TH Sarabun New"/>
+                <w:sz w:val="24"/>
+                <w:szCs w:val="24"/>
+              </w:rPr>
+            </w:pPr>
+            <w:r>
+              <w:rPr>
+                <w:rFonts w:ascii="TH Sarabun New" w:hAnsi="TH Sarabun New" w:cs="TH Sarabun New"/>
+                <w:sz w:val="24"/>
+                <w:szCs w:val="24"/>
+                <w:cs/>
+              </w:rPr>
+              <w:t>๑)</w:t>
+            </w:r>
+            <w:r>
+              <w:rPr>
+                <w:rFonts w:ascii="TH Sarabun New" w:hAnsi="TH Sarabun New" w:cs="TH Sarabun New"/>
+                <w:sz w:val="24"/>
+                <w:szCs w:val="24"/>
+                <w:cs/>
+              </w:rPr>
+              <w:t xml:space="preserve"> </w:t>
+            </w:r>
+            <w:r>
+              <w:rPr>
+                <w:rFonts w:ascii="TH Sarabun New" w:hAnsi="TH Sarabun New" w:cs="TH Sarabun New"/>
+                <w:sz w:val="24"/>
+                <w:szCs w:val="24"/>
+                <w:cs/>
+              </w:rPr>
+              <w:t>มีการวางแผนการสอนอย่างเป็นระบบ โดยกำหนดจุดมุ่งหมายของการสอนไว้ชัดเจน และใช้วิธีการสอนที่เหมาะสมเพื่อให้ผลการสอนเป็นไปตามจุดมุ่งหมายที่วางไว้</w:t>
+            </w:r>
+          </w:p>
+          <w:p>
+            <w:pPr>
+              <w:spacing w:after="0"/>
+              <w:jc w:val="thaiDistribute"/>
+              <w:rPr>
+                <w:rFonts w:ascii="TH Sarabun New" w:hAnsi="TH Sarabun New" w:cs="TH Sarabun New"/>
+                <w:sz w:val="24"/>
+                <w:szCs w:val="24"/>
+              </w:rPr>
+            </w:pPr>
+            <w:r>
+              <w:rPr>
+                <w:rFonts w:ascii="TH Sarabun New" w:hAnsi="TH Sarabun New" w:cs="TH Sarabun New"/>
+                <w:sz w:val="24"/>
+                <w:szCs w:val="24"/>
+                <w:cs/>
+              </w:rPr>
+              <w:t>๒)</w:t>
+            </w:r>
+            <w:r>
+              <w:rPr>
+                <w:rFonts w:ascii="TH Sarabun New" w:hAnsi="TH Sarabun New" w:cs="TH Sarabun New"/>
+                <w:sz w:val="24"/>
+                <w:szCs w:val="24"/>
+                <w:cs/>
+              </w:rPr>
+              <w:t xml:space="preserve"> </w:t>
+            </w:r>
+            <w:r>
+              <w:rPr>
+                <w:rFonts w:ascii="TH Sarabun New" w:hAnsi="TH Sarabun New" w:cs="TH Sarabun New"/>
+                <w:sz w:val="24"/>
+                <w:szCs w:val="24"/>
+                <w:cs/>
+              </w:rPr>
+              <w:t xml:space="preserve">มีความชัดเจน สอดคล้องและความเหมาะสมของหัวข้อ เนื้อหาที่สอน และกิจกรรมการเรียนการสอนที่กำหนดไว้ในแผนการสอน </w:t>
+            </w:r>
+          </w:p>
+          <w:p>
+            <w:pPr>
+              <w:spacing w:after="0"/>
+              <w:jc w:val="thaiDistribute"/>
+              <w:rPr>
+                <w:rFonts w:ascii="TH Sarabun New" w:hAnsi="TH Sarabun New" w:cs="TH Sarabun New"/>
+                <w:sz w:val="24"/>
+                <w:szCs w:val="24"/>
+              </w:rPr>
+            </w:pPr>
+            <w:r>
+              <w:rPr>
+                <w:rFonts w:ascii="TH Sarabun New" w:hAnsi="TH Sarabun New" w:cs="TH Sarabun New"/>
+                <w:sz w:val="24"/>
+                <w:szCs w:val="24"/>
+                <w:cs/>
+              </w:rPr>
+              <w:t>ต่อการนำไปสู่การสัมฤทธิ์ผลตามจุดมุ่งหมายที่กำหนดไว้ของวิชาหรือหัวข้อที่สอน</w:t>
+            </w:r>
+          </w:p>
+          <w:p>
+            <w:pPr>
+              <w:spacing w:after="0"/>
+              <w:jc w:val="thaiDistribute"/>
+              <w:rPr>
+                <w:rFonts w:ascii="TH Sarabun New" w:hAnsi="TH Sarabun New" w:cs="TH Sarabun New"/>
+                <w:sz w:val="24"/>
+                <w:szCs w:val="24"/>
+              </w:rPr>
+            </w:pPr>
+            <w:r>
+              <w:rPr>
+                <w:rFonts w:ascii="TH Sarabun New" w:hAnsi="TH Sarabun New" w:cs="TH Sarabun New"/>
+                <w:sz w:val="24"/>
+                <w:szCs w:val="24"/>
+                <w:cs/>
+              </w:rPr>
+              <w:t>๓)</w:t>
+            </w:r>
+            <w:r>
+              <w:rPr>
+                <w:rFonts w:ascii="TH Sarabun New" w:hAnsi="TH Sarabun New" w:cs="TH Sarabun New"/>
+                <w:sz w:val="24"/>
+                <w:szCs w:val="24"/>
+                <w:cs/>
+              </w:rPr>
+              <w:t xml:space="preserve"> </w:t>
+            </w:r>
+            <w:r>
+              <w:rPr>
+                <w:rFonts w:ascii="TH Sarabun New" w:hAnsi="TH Sarabun New" w:cs="TH Sarabun New"/>
+                <w:sz w:val="24"/>
+                <w:szCs w:val="24"/>
+                <w:cs/>
+              </w:rPr>
+              <w:t>มีความเหมาะสมและความน่าเชื่อถือของเกณฑ์และวิธีการประเมินการเรียนรู้ที่กำหนดไว้ในแผนการสอนกับเนื้อหาและจุดมุ่งหมายของรายวิชาหรือหัวข้อที่สอน</w:t>
+            </w:r>
+          </w:p>
+          <w:p>
+            <w:pPr>
+              <w:spacing w:after="0"/>
+              <w:jc w:val="thaiDistribute"/>
+              <w:rPr>
+                <w:rFonts w:ascii="TH Sarabun New" w:hAnsi="TH Sarabun New" w:cs="TH Sarabun New"/>
+                <w:sz w:val="24"/>
+                <w:szCs w:val="24"/>
+                <w:cs/>
+              </w:rPr>
+            </w:pPr>
+            <w:r>
+              <w:rPr>
+                <w:rFonts w:ascii="TH Sarabun New" w:hAnsi="TH Sarabun New" w:cs="TH Sarabun New"/>
+                <w:sz w:val="24"/>
+                <w:szCs w:val="24"/>
+                <w:cs/>
+              </w:rPr>
+              <w:t>๔)</w:t>
+            </w:r>
+            <w:r>
+              <w:rPr>
+                <w:rFonts w:ascii="TH Sarabun New" w:hAnsi="TH Sarabun New" w:cs="TH Sarabun New"/>
+                <w:sz w:val="24"/>
+                <w:szCs w:val="24"/>
+                <w:cs/>
+              </w:rPr>
+              <w:t xml:space="preserve"> </w:t>
+            </w:r>
+            <w:r>
+              <w:rPr>
+                <w:rFonts w:ascii="TH Sarabun New" w:hAnsi="TH Sarabun New" w:cs="TH Sarabun New"/>
+                <w:sz w:val="24"/>
+                <w:szCs w:val="24"/>
+                <w:cs/>
+              </w:rPr>
+              <w:t>มีความสามารถในการประเมินความรู้ความเข้าใจของผู้เรียน</w:t>
+            </w:r>
+          </w:p>
+        </w:tc>
+        <w:tc>
+          <w:tcPr>
+            <w:tcW w:w="567" w:type="dxa"/>
+          </w:tcPr>
+          <w:p>
+            <w:pPr>
+              <w:spacing w:after="0"/>
+              <w:rPr>
+                <w:rFonts w:ascii="TH Sarabun New" w:hAnsi="TH Sarabun New" w:cs="TH Sarabun New"/>
+                <w:sz w:val="24"/>
+                <w:szCs w:val="24"/>
+                <w:cs/>
+              </w:rPr>
+            </w:pPr>
+            <w:r>
+              <w:rPr>
+                <w:rFonts w:ascii="TH Sarabun New" w:hAnsi="TH Sarabun New" w:cs="TH Sarabun New"/>
+                <w:sz w:val="24"/>
+                <w:szCs w:val="24"/>
+              </w:rPr>
+              <w:t>{{score2</w:t>
+            </w:r>
+            <w:r>
+              <w:rPr>
+                <w:rFonts w:ascii="TH Sarabun New" w:hAnsi="TH Sarabun New" w:cs="TH Sarabun New"/>
+                <w:sz w:val="24"/>
+                <w:szCs w:val="24"/>
+              </w:rPr>
+              <w:t>1</w:t>
             </w:r>
             <w:r>
               <w:rPr>
@@ -1225,23 +1637,7 @@
                 <w:sz w:val="24"/>
                 <w:szCs w:val="24"/>
               </w:rPr>
-              <w:t>{{score1</w:t>
-            </w:r>
-            <w:r>
-              <w:rPr>
-                <w:rFonts w:ascii="TH Sarabun New" w:hAnsi="TH Sarabun New" w:cs="TH Sarabun New"/>
-                <w:sz w:val="24"/>
-                <w:szCs w:val="24"/>
-              </w:rPr>
-              <w:t>3</w:t>
-            </w:r>
-            <w:r>
-              <w:rPr>
-                <w:rFonts w:ascii="TH Sarabun New" w:hAnsi="TH Sarabun New" w:cs="TH Sarabun New"/>
-                <w:sz w:val="24"/>
-                <w:szCs w:val="24"/>
-              </w:rPr>
-              <w:t>}}</w:t>
+              <w:t>{{score22}}</w:t>
             </w:r>
           </w:p>
         </w:tc>
@@ -1265,23 +1661,7 @@
                 <w:sz w:val="24"/>
                 <w:szCs w:val="24"/>
               </w:rPr>
-              <w:t>{{score1</w:t>
-            </w:r>
-            <w:r>
-              <w:rPr>
-                <w:rFonts w:ascii="TH Sarabun New" w:hAnsi="TH Sarabun New" w:cs="TH Sarabun New"/>
-                <w:sz w:val="24"/>
-                <w:szCs w:val="24"/>
-              </w:rPr>
-              <w:t>4</w:t>
-            </w:r>
-            <w:r>
-              <w:rPr>
-                <w:rFonts w:ascii="TH Sarabun New" w:hAnsi="TH Sarabun New" w:cs="TH Sarabun New"/>
-                <w:sz w:val="24"/>
-                <w:szCs w:val="24"/>
-              </w:rPr>
-              <w:t>}}</w:t>
+              <w:t>{{score23}}</w:t>
             </w:r>
           </w:p>
         </w:tc>
@@ -1305,23 +1685,31 @@
                 <w:sz w:val="24"/>
                 <w:szCs w:val="24"/>
               </w:rPr>
-              <w:t>{{score1</w:t>
-            </w:r>
-            <w:r>
-              <w:rPr>
-                <w:rFonts w:ascii="TH Sarabun New" w:hAnsi="TH Sarabun New" w:cs="TH Sarabun New"/>
-                <w:sz w:val="24"/>
-                <w:szCs w:val="24"/>
-              </w:rPr>
-              <w:t>5</w:t>
-            </w:r>
-            <w:r>
-              <w:rPr>
-                <w:rFonts w:ascii="TH Sarabun New" w:hAnsi="TH Sarabun New" w:cs="TH Sarabun New"/>
-                <w:sz w:val="24"/>
-                <w:szCs w:val="24"/>
-              </w:rPr>
-              <w:t>}}</w:t>
+              <w:t>{{score24}}</w:t>
+            </w:r>
+          </w:p>
+        </w:tc>
+        <w:tc>
+          <w:tcPr>
+            <w:tcW w:w="567" w:type="dxa"/>
+          </w:tcPr>
+          <w:p>
+            <w:pPr>
+              <w:spacing w:after="0"/>
+              <w:rPr>
+                <w:rFonts w:ascii="TH Sarabun New" w:hAnsi="TH Sarabun New" w:cs="TH Sarabun New"/>
+                <w:sz w:val="24"/>
+                <w:szCs w:val="24"/>
+                <w:cs/>
+              </w:rPr>
+            </w:pPr>
+            <w:r>
+              <w:rPr>
+                <w:rFonts w:ascii="TH Sarabun New" w:hAnsi="TH Sarabun New" w:cs="TH Sarabun New"/>
+                <w:sz w:val="24"/>
+                <w:szCs w:val="24"/>
+              </w:rPr>
+              <w:t>{{score25}}</w:t>
             </w:r>
           </w:p>
         </w:tc>
@@ -1347,7 +1735,7 @@
                 <w:szCs w:val="24"/>
                 <w:cs/>
               </w:rPr>
-              <w:t>๒๐</w:t>
+              <w:t>๓๐</w:t>
             </w:r>
           </w:p>
         </w:tc>
@@ -1372,23 +1760,7 @@
                 <w:sz w:val="24"/>
                 <w:szCs w:val="24"/>
               </w:rPr>
-              <w:t>{{score1</w:t>
-            </w:r>
-            <w:r>
-              <w:rPr>
-                <w:rFonts w:ascii="TH Sarabun New" w:hAnsi="TH Sarabun New" w:cs="TH Sarabun New"/>
-                <w:sz w:val="24"/>
-                <w:szCs w:val="24"/>
-              </w:rPr>
-              <w:t>x</w:t>
-            </w:r>
-            <w:r>
-              <w:rPr>
-                <w:rFonts w:ascii="TH Sarabun New" w:hAnsi="TH Sarabun New" w:cs="TH Sarabun New"/>
-                <w:sz w:val="24"/>
-                <w:szCs w:val="24"/>
-              </w:rPr>
-              <w:t>}}</w:t>
+              <w:t>{{score2x}}</w:t>
             </w:r>
           </w:p>
         </w:tc>
@@ -1403,17 +1775,126 @@
                 <w:rFonts w:ascii="TH Sarabun New" w:hAnsi="TH Sarabun New" w:cs="TH Sarabun New"/>
                 <w:sz w:val="20"/>
                 <w:szCs w:val="20"/>
-                <w:cs/>
-              </w:rPr>
-            </w:pPr>
-            <w:r>
-              <w:rPr>
-                <w:rFonts w:ascii="TH Sarabun New" w:hAnsi="TH Sarabun New" w:cs="TH Sarabun New"/>
-                <w:sz w:val="20"/>
-                <w:szCs w:val="20"/>
-                <w:cs/>
-              </w:rPr>
-              <w:t>-เอกสารหลักฐานตามข้อ ๘.๑ ของประกาศมหาวิทยาลัย</w:t>
+              </w:rPr>
+            </w:pPr>
+            <w:r>
+              <w:rPr>
+                <w:rFonts w:ascii="TH Sarabun New" w:hAnsi="TH Sarabun New" w:cs="TH Sarabun New"/>
+                <w:sz w:val="20"/>
+                <w:szCs w:val="20"/>
+                <w:cs/>
+              </w:rPr>
+              <w:t>-แผนการสอนและข้อมูลรายละเอียดของหัวข้อ/</w:t>
+            </w:r>
+            <w:r>
+              <w:rPr>
+                <w:rFonts w:ascii="TH Sarabun New" w:hAnsi="TH Sarabun New" w:cs="TH Sarabun New"/>
+                <w:sz w:val="20"/>
+                <w:szCs w:val="20"/>
+                <w:cs/>
+              </w:rPr>
+              <w:t xml:space="preserve"> </w:t>
+            </w:r>
+            <w:r>
+              <w:rPr>
+                <w:rFonts w:ascii="TH Sarabun New" w:hAnsi="TH Sarabun New" w:cs="TH Sarabun New"/>
+                <w:sz w:val="20"/>
+                <w:szCs w:val="20"/>
+                <w:cs/>
+              </w:rPr>
+              <w:t>วิชาที่สอน ในส่วนที่ผู้ขอเป็นผู้สอน</w:t>
+            </w:r>
+            <w:r>
+              <w:rPr>
+                <w:rFonts w:ascii="TH Sarabun New" w:hAnsi="TH Sarabun New" w:cs="TH Sarabun New"/>
+                <w:sz w:val="20"/>
+                <w:szCs w:val="20"/>
+                <w:cs/>
+              </w:rPr>
+              <w:t xml:space="preserve"> เช่น มคอ. ๓ มคอ.๕</w:t>
+            </w:r>
+            <w:r>
+              <w:rPr>
+                <w:rFonts w:ascii="TH Sarabun New" w:hAnsi="TH Sarabun New" w:cs="TH Sarabun New"/>
+                <w:sz w:val="20"/>
+                <w:szCs w:val="20"/>
+                <w:cs/>
+              </w:rPr>
+              <w:t>และ/หรือ แผนการสอนใน</w:t>
+            </w:r>
+            <w:r>
+              <w:rPr>
+                <w:rFonts w:ascii="TH Sarabun New" w:hAnsi="TH Sarabun New" w:cs="TH Sarabun New"/>
+                <w:sz w:val="20"/>
+                <w:szCs w:val="20"/>
+                <w:cs/>
+              </w:rPr>
+              <w:t>แบบฟอร์มอื่นที่กำหนดโดยส่วนงาน</w:t>
+            </w:r>
+          </w:p>
+          <w:p>
+            <w:pPr>
+              <w:spacing w:after="0"/>
+              <w:rPr>
+                <w:rFonts w:ascii="TH Sarabun New" w:hAnsi="TH Sarabun New" w:cs="TH Sarabun New"/>
+                <w:sz w:val="20"/>
+                <w:szCs w:val="20"/>
+                <w:cs/>
+              </w:rPr>
+            </w:pPr>
+            <w:r>
+              <w:rPr>
+                <w:rFonts w:ascii="TH Sarabun New" w:hAnsi="TH Sarabun New" w:cs="TH Sarabun New"/>
+                <w:sz w:val="20"/>
+                <w:szCs w:val="20"/>
+                <w:cs/>
+              </w:rPr>
+              <w:t>-</w:t>
+            </w:r>
+            <w:r>
+              <w:rPr>
+                <w:rFonts w:ascii="TH Sarabun New" w:hAnsi="TH Sarabun New" w:cs="TH Sarabun New"/>
+                <w:sz w:val="20"/>
+                <w:szCs w:val="20"/>
+                <w:cs/>
+              </w:rPr>
+              <w:t>ผลประเมินการสอนโดยนักศึกษาและ/</w:t>
+            </w:r>
+            <w:r>
+              <w:rPr>
+                <w:rFonts w:ascii="TH Sarabun New" w:hAnsi="TH Sarabun New" w:cs="TH Sarabun New"/>
+                <w:sz w:val="20"/>
+                <w:szCs w:val="20"/>
+                <w:cs/>
+              </w:rPr>
+              <w:t xml:space="preserve"> </w:t>
+            </w:r>
+            <w:r>
+              <w:rPr>
+                <w:rFonts w:ascii="TH Sarabun New" w:hAnsi="TH Sarabun New" w:cs="TH Sarabun New"/>
+                <w:sz w:val="20"/>
+                <w:szCs w:val="20"/>
+                <w:cs/>
+              </w:rPr>
+              <w:t>หรือผู้มีส่วนเกี่ยวข้อง และอื่น</w:t>
+            </w:r>
+            <w:r>
+              <w:rPr>
+                <w:rFonts w:ascii="TH Sarabun New" w:hAnsi="TH Sarabun New" w:cs="TH Sarabun New"/>
+                <w:sz w:val="20"/>
+                <w:szCs w:val="20"/>
+                <w:cs/>
+              </w:rPr>
+              <w:t xml:space="preserve"> </w:t>
+            </w:r>
+            <w:r>
+              <w:rPr>
+                <w:rFonts w:ascii="TH Sarabun New" w:hAnsi="TH Sarabun New" w:cs="TH Sarabun New"/>
+                <w:sz w:val="20"/>
+                <w:szCs w:val="20"/>
+                <w:cs/>
+              </w:rPr>
+              <w:t>ๆ</w:t>
             </w:r>
           </w:p>
         </w:tc>
@@ -1445,7 +1926,7 @@
                 <w:szCs w:val="24"/>
                 <w:cs/>
               </w:rPr>
-              <w:t>๒</w:t>
+              <w:t>๓</w:t>
             </w:r>
           </w:p>
         </w:tc>
@@ -1471,655 +1952,6 @@
                 <w:szCs w:val="24"/>
                 <w:cs/>
               </w:rPr>
-              <w:t>ความสามารถด้านการวางแผนการสอนและการประเมินผลการเรียนการสอน</w:t>
-            </w:r>
-            <w:r>
-              <w:rPr>
-                <w:rFonts w:ascii="TH Sarabun New" w:hAnsi="TH Sarabun New" w:cs="TH Sarabun New"/>
-                <w:sz w:val="24"/>
-                <w:szCs w:val="24"/>
-                <w:cs/>
-              </w:rPr>
-              <w:t xml:space="preserve"> (ให้คูณระดับประเมินที่ได้ด้วย ๖)</w:t>
-            </w:r>
-          </w:p>
-          <w:p>
-            <w:pPr>
-              <w:spacing w:after="0"/>
-              <w:jc w:val="thaiDistribute"/>
-              <w:rPr>
-                <w:rFonts w:ascii="TH Sarabun New" w:hAnsi="TH Sarabun New" w:cs="TH Sarabun New"/>
-                <w:sz w:val="24"/>
-                <w:szCs w:val="24"/>
-              </w:rPr>
-            </w:pPr>
-            <w:r>
-              <w:rPr>
-                <w:rFonts w:ascii="TH Sarabun New" w:hAnsi="TH Sarabun New" w:cs="TH Sarabun New"/>
-                <w:sz w:val="24"/>
-                <w:szCs w:val="24"/>
-                <w:cs/>
-              </w:rPr>
-              <w:t>๑)</w:t>
-            </w:r>
-            <w:r>
-              <w:rPr>
-                <w:rFonts w:ascii="TH Sarabun New" w:hAnsi="TH Sarabun New" w:cs="TH Sarabun New"/>
-                <w:sz w:val="24"/>
-                <w:szCs w:val="24"/>
-                <w:cs/>
-              </w:rPr>
-              <w:t xml:space="preserve"> </w:t>
-            </w:r>
-            <w:r>
-              <w:rPr>
-                <w:rFonts w:ascii="TH Sarabun New" w:hAnsi="TH Sarabun New" w:cs="TH Sarabun New"/>
-                <w:sz w:val="24"/>
-                <w:szCs w:val="24"/>
-                <w:cs/>
-              </w:rPr>
-              <w:t>มีการวางแผนการสอนอย่างเป็นระบบ โดยกำหนดจุดมุ่งหมายของการสอนไว้ชัดเจน และใช้วิธีการสอนที่เหมาะสมเพื่อให้ผลการสอนเป็นไปตามจุดมุ่งหมายที่วางไว้</w:t>
-            </w:r>
-          </w:p>
-          <w:p>
-            <w:pPr>
-              <w:spacing w:after="0"/>
-              <w:jc w:val="thaiDistribute"/>
-              <w:rPr>
-                <w:rFonts w:ascii="TH Sarabun New" w:hAnsi="TH Sarabun New" w:cs="TH Sarabun New"/>
-                <w:sz w:val="24"/>
-                <w:szCs w:val="24"/>
-              </w:rPr>
-            </w:pPr>
-            <w:r>
-              <w:rPr>
-                <w:rFonts w:ascii="TH Sarabun New" w:hAnsi="TH Sarabun New" w:cs="TH Sarabun New"/>
-                <w:sz w:val="24"/>
-                <w:szCs w:val="24"/>
-                <w:cs/>
-              </w:rPr>
-              <w:t>๒)</w:t>
-            </w:r>
-            <w:r>
-              <w:rPr>
-                <w:rFonts w:ascii="TH Sarabun New" w:hAnsi="TH Sarabun New" w:cs="TH Sarabun New"/>
-                <w:sz w:val="24"/>
-                <w:szCs w:val="24"/>
-                <w:cs/>
-              </w:rPr>
-              <w:t xml:space="preserve"> </w:t>
-            </w:r>
-            <w:r>
-              <w:rPr>
-                <w:rFonts w:ascii="TH Sarabun New" w:hAnsi="TH Sarabun New" w:cs="TH Sarabun New"/>
-                <w:sz w:val="24"/>
-                <w:szCs w:val="24"/>
-                <w:cs/>
-              </w:rPr>
-              <w:t xml:space="preserve">มีความชัดเจน สอดคล้องและความเหมาะสมของหัวข้อ เนื้อหาที่สอน และกิจกรรมการเรียนการสอนที่กำหนดไว้ในแผนการสอน </w:t>
-            </w:r>
-          </w:p>
-          <w:p>
-            <w:pPr>
-              <w:spacing w:after="0"/>
-              <w:jc w:val="thaiDistribute"/>
-              <w:rPr>
-                <w:rFonts w:ascii="TH Sarabun New" w:hAnsi="TH Sarabun New" w:cs="TH Sarabun New"/>
-                <w:sz w:val="24"/>
-                <w:szCs w:val="24"/>
-              </w:rPr>
-            </w:pPr>
-            <w:r>
-              <w:rPr>
-                <w:rFonts w:ascii="TH Sarabun New" w:hAnsi="TH Sarabun New" w:cs="TH Sarabun New"/>
-                <w:sz w:val="24"/>
-                <w:szCs w:val="24"/>
-                <w:cs/>
-              </w:rPr>
-              <w:t>ต่อการนำไปสู่การสัมฤทธิ์ผลตามจุดมุ่งหมายที่กำหนดไว้ของวิชาหรือหัวข้อที่สอน</w:t>
-            </w:r>
-          </w:p>
-          <w:p>
-            <w:pPr>
-              <w:spacing w:after="0"/>
-              <w:jc w:val="thaiDistribute"/>
-              <w:rPr>
-                <w:rFonts w:ascii="TH Sarabun New" w:hAnsi="TH Sarabun New" w:cs="TH Sarabun New"/>
-                <w:sz w:val="24"/>
-                <w:szCs w:val="24"/>
-              </w:rPr>
-            </w:pPr>
-            <w:r>
-              <w:rPr>
-                <w:rFonts w:ascii="TH Sarabun New" w:hAnsi="TH Sarabun New" w:cs="TH Sarabun New"/>
-                <w:sz w:val="24"/>
-                <w:szCs w:val="24"/>
-                <w:cs/>
-              </w:rPr>
-              <w:t>๓)</w:t>
-            </w:r>
-            <w:r>
-              <w:rPr>
-                <w:rFonts w:ascii="TH Sarabun New" w:hAnsi="TH Sarabun New" w:cs="TH Sarabun New"/>
-                <w:sz w:val="24"/>
-                <w:szCs w:val="24"/>
-                <w:cs/>
-              </w:rPr>
-              <w:t xml:space="preserve"> </w:t>
-            </w:r>
-            <w:r>
-              <w:rPr>
-                <w:rFonts w:ascii="TH Sarabun New" w:hAnsi="TH Sarabun New" w:cs="TH Sarabun New"/>
-                <w:sz w:val="24"/>
-                <w:szCs w:val="24"/>
-                <w:cs/>
-              </w:rPr>
-              <w:t>มีความเหมาะสมและความน่าเชื่อถือของเกณฑ์และวิธีการประเมินการเรียนรู้ที่กำหนดไว้ในแผนการสอนกับเนื้อหาและจุดมุ่งหมายของรายวิชาหรือหัวข้อที่สอน</w:t>
-            </w:r>
-          </w:p>
-          <w:p>
-            <w:pPr>
-              <w:spacing w:after="0"/>
-              <w:jc w:val="thaiDistribute"/>
-              <w:rPr>
-                <w:rFonts w:ascii="TH Sarabun New" w:hAnsi="TH Sarabun New" w:cs="TH Sarabun New"/>
-                <w:sz w:val="24"/>
-                <w:szCs w:val="24"/>
-                <w:cs/>
-              </w:rPr>
-            </w:pPr>
-            <w:r>
-              <w:rPr>
-                <w:rFonts w:ascii="TH Sarabun New" w:hAnsi="TH Sarabun New" w:cs="TH Sarabun New"/>
-                <w:sz w:val="24"/>
-                <w:szCs w:val="24"/>
-                <w:cs/>
-              </w:rPr>
-              <w:t>๔)</w:t>
-            </w:r>
-            <w:r>
-              <w:rPr>
-                <w:rFonts w:ascii="TH Sarabun New" w:hAnsi="TH Sarabun New" w:cs="TH Sarabun New"/>
-                <w:sz w:val="24"/>
-                <w:szCs w:val="24"/>
-                <w:cs/>
-              </w:rPr>
-              <w:t xml:space="preserve"> </w:t>
-            </w:r>
-            <w:r>
-              <w:rPr>
-                <w:rFonts w:ascii="TH Sarabun New" w:hAnsi="TH Sarabun New" w:cs="TH Sarabun New"/>
-                <w:sz w:val="24"/>
-                <w:szCs w:val="24"/>
-                <w:cs/>
-              </w:rPr>
-              <w:t>มีความสามารถในการประเมินความรู้ความเข้าใจของผู้เรียน</w:t>
-            </w:r>
-          </w:p>
-        </w:tc>
-        <w:tc>
-          <w:tcPr>
-            <w:tcW w:w="567" w:type="dxa"/>
-          </w:tcPr>
-          <w:p>
-            <w:pPr>
-              <w:spacing w:after="0"/>
-              <w:rPr>
-                <w:rFonts w:ascii="TH Sarabun New" w:hAnsi="TH Sarabun New" w:cs="TH Sarabun New"/>
-                <w:sz w:val="24"/>
-                <w:szCs w:val="24"/>
-                <w:cs/>
-              </w:rPr>
-            </w:pPr>
-            <w:r>
-              <w:rPr>
-                <w:rFonts w:ascii="TH Sarabun New" w:hAnsi="TH Sarabun New" w:cs="TH Sarabun New"/>
-                <w:sz w:val="24"/>
-                <w:szCs w:val="24"/>
-              </w:rPr>
-              <w:t>{{score</w:t>
-            </w:r>
-            <w:r>
-              <w:rPr>
-                <w:rFonts w:ascii="TH Sarabun New" w:hAnsi="TH Sarabun New" w:cs="TH Sarabun New"/>
-                <w:sz w:val="24"/>
-                <w:szCs w:val="24"/>
-              </w:rPr>
-              <w:t>2</w:t>
-            </w:r>
-            <w:r>
-              <w:rPr>
-                <w:rFonts w:ascii="TH Sarabun New" w:hAnsi="TH Sarabun New" w:cs="TH Sarabun New"/>
-                <w:sz w:val="24"/>
-                <w:szCs w:val="24"/>
-              </w:rPr>
-              <w:t>1</w:t>
-            </w:r>
-            <w:r>
-              <w:rPr>
-                <w:rFonts w:ascii="TH Sarabun New" w:hAnsi="TH Sarabun New" w:cs="TH Sarabun New"/>
-                <w:sz w:val="24"/>
-                <w:szCs w:val="24"/>
-              </w:rPr>
-              <w:t>}}</w:t>
-            </w:r>
-          </w:p>
-        </w:tc>
-        <w:tc>
-          <w:tcPr>
-            <w:tcW w:w="567" w:type="dxa"/>
-          </w:tcPr>
-          <w:p>
-            <w:pPr>
-              <w:spacing w:after="0"/>
-              <w:rPr>
-                <w:rFonts w:ascii="TH Sarabun New" w:hAnsi="TH Sarabun New" w:cs="TH Sarabun New"/>
-                <w:sz w:val="24"/>
-                <w:szCs w:val="24"/>
-                <w:cs/>
-              </w:rPr>
-            </w:pPr>
-            <w:r>
-              <w:rPr>
-                <w:rFonts w:ascii="TH Sarabun New" w:hAnsi="TH Sarabun New" w:cs="TH Sarabun New"/>
-                <w:sz w:val="24"/>
-                <w:szCs w:val="24"/>
-              </w:rPr>
-              <w:t>{{score</w:t>
-            </w:r>
-            <w:r>
-              <w:rPr>
-                <w:rFonts w:ascii="TH Sarabun New" w:hAnsi="TH Sarabun New" w:cs="TH Sarabun New"/>
-                <w:sz w:val="24"/>
-                <w:szCs w:val="24"/>
-              </w:rPr>
-              <w:t>22</w:t>
-            </w:r>
-            <w:r>
-              <w:rPr>
-                <w:rFonts w:ascii="TH Sarabun New" w:hAnsi="TH Sarabun New" w:cs="TH Sarabun New"/>
-                <w:sz w:val="24"/>
-                <w:szCs w:val="24"/>
-              </w:rPr>
-              <w:t>}}</w:t>
-            </w:r>
-          </w:p>
-        </w:tc>
-        <w:tc>
-          <w:tcPr>
-            <w:tcW w:w="567" w:type="dxa"/>
-          </w:tcPr>
-          <w:p>
-            <w:pPr>
-              <w:spacing w:after="0"/>
-              <w:rPr>
-                <w:rFonts w:ascii="TH Sarabun New" w:hAnsi="TH Sarabun New" w:cs="TH Sarabun New"/>
-                <w:sz w:val="24"/>
-                <w:szCs w:val="24"/>
-                <w:cs/>
-              </w:rPr>
-            </w:pPr>
-            <w:r>
-              <w:rPr>
-                <w:rFonts w:ascii="TH Sarabun New" w:hAnsi="TH Sarabun New" w:cs="TH Sarabun New"/>
-                <w:sz w:val="24"/>
-                <w:szCs w:val="24"/>
-              </w:rPr>
-              <w:t>{{score</w:t>
-            </w:r>
-            <w:r>
-              <w:rPr>
-                <w:rFonts w:ascii="TH Sarabun New" w:hAnsi="TH Sarabun New" w:cs="TH Sarabun New"/>
-                <w:sz w:val="24"/>
-                <w:szCs w:val="24"/>
-              </w:rPr>
-              <w:t>23</w:t>
-            </w:r>
-            <w:r>
-              <w:rPr>
-                <w:rFonts w:ascii="TH Sarabun New" w:hAnsi="TH Sarabun New" w:cs="TH Sarabun New"/>
-                <w:sz w:val="24"/>
-                <w:szCs w:val="24"/>
-              </w:rPr>
-              <w:t>}}</w:t>
-            </w:r>
-          </w:p>
-        </w:tc>
-        <w:tc>
-          <w:tcPr>
-            <w:tcW w:w="567" w:type="dxa"/>
-          </w:tcPr>
-          <w:p>
-            <w:pPr>
-              <w:spacing w:after="0"/>
-              <w:rPr>
-                <w:rFonts w:ascii="TH Sarabun New" w:hAnsi="TH Sarabun New" w:cs="TH Sarabun New"/>
-                <w:sz w:val="24"/>
-                <w:szCs w:val="24"/>
-                <w:cs/>
-              </w:rPr>
-            </w:pPr>
-            <w:r>
-              <w:rPr>
-                <w:rFonts w:ascii="TH Sarabun New" w:hAnsi="TH Sarabun New" w:cs="TH Sarabun New"/>
-                <w:sz w:val="24"/>
-                <w:szCs w:val="24"/>
-              </w:rPr>
-              <w:t>{{score</w:t>
-            </w:r>
-            <w:r>
-              <w:rPr>
-                <w:rFonts w:ascii="TH Sarabun New" w:hAnsi="TH Sarabun New" w:cs="TH Sarabun New"/>
-                <w:sz w:val="24"/>
-                <w:szCs w:val="24"/>
-              </w:rPr>
-              <w:t>24</w:t>
-            </w:r>
-            <w:r>
-              <w:rPr>
-                <w:rFonts w:ascii="TH Sarabun New" w:hAnsi="TH Sarabun New" w:cs="TH Sarabun New"/>
-                <w:sz w:val="24"/>
-                <w:szCs w:val="24"/>
-              </w:rPr>
-              <w:t>}}</w:t>
-            </w:r>
-          </w:p>
-        </w:tc>
-        <w:tc>
-          <w:tcPr>
-            <w:tcW w:w="567" w:type="dxa"/>
-          </w:tcPr>
-          <w:p>
-            <w:pPr>
-              <w:spacing w:after="0"/>
-              <w:rPr>
-                <w:rFonts w:ascii="TH Sarabun New" w:hAnsi="TH Sarabun New" w:cs="TH Sarabun New"/>
-                <w:sz w:val="24"/>
-                <w:szCs w:val="24"/>
-                <w:cs/>
-              </w:rPr>
-            </w:pPr>
-            <w:r>
-              <w:rPr>
-                <w:rFonts w:ascii="TH Sarabun New" w:hAnsi="TH Sarabun New" w:cs="TH Sarabun New"/>
-                <w:sz w:val="24"/>
-                <w:szCs w:val="24"/>
-              </w:rPr>
-              <w:t>{{score</w:t>
-            </w:r>
-            <w:r>
-              <w:rPr>
-                <w:rFonts w:ascii="TH Sarabun New" w:hAnsi="TH Sarabun New" w:cs="TH Sarabun New"/>
-                <w:sz w:val="24"/>
-                <w:szCs w:val="24"/>
-              </w:rPr>
-              <w:t>25</w:t>
-            </w:r>
-            <w:r>
-              <w:rPr>
-                <w:rFonts w:ascii="TH Sarabun New" w:hAnsi="TH Sarabun New" w:cs="TH Sarabun New"/>
-                <w:sz w:val="24"/>
-                <w:szCs w:val="24"/>
-              </w:rPr>
-              <w:t>}}</w:t>
-            </w:r>
-          </w:p>
-        </w:tc>
-        <w:tc>
-          <w:tcPr>
-            <w:tcW w:w="850" w:type="dxa"/>
-          </w:tcPr>
-          <w:p>
-            <w:pPr>
-              <w:spacing w:after="0"/>
-              <w:jc w:val="center"/>
-              <w:rPr>
-                <w:rFonts w:ascii="TH Sarabun New" w:hAnsi="TH Sarabun New" w:cs="TH Sarabun New"/>
-                <w:sz w:val="24"/>
-                <w:szCs w:val="24"/>
-                <w:cs/>
-              </w:rPr>
-            </w:pPr>
-            <w:r>
-              <w:rPr>
-                <w:rFonts w:ascii="TH Sarabun New" w:hAnsi="TH Sarabun New" w:cs="TH Sarabun New"/>
-                <w:sz w:val="24"/>
-                <w:szCs w:val="24"/>
-                <w:cs/>
-              </w:rPr>
-              <w:t>๓๐</w:t>
-            </w:r>
-          </w:p>
-        </w:tc>
-        <w:tc>
-          <w:tcPr>
-            <w:tcW w:w="704" w:type="dxa"/>
-          </w:tcPr>
-          <w:p>
-            <w:pPr>
-              <w:spacing w:after="0"/>
-              <w:jc w:val="center"/>
-              <w:rPr>
-                <w:rFonts w:ascii="TH Sarabun New" w:hAnsi="TH Sarabun New" w:cs="TH Sarabun New"/>
-                <w:sz w:val="24"/>
-                <w:szCs w:val="24"/>
-                <w:cs/>
-              </w:rPr>
-            </w:pPr>
-            <w:r>
-              <w:rPr>
-                <w:rFonts w:ascii="TH Sarabun New" w:hAnsi="TH Sarabun New" w:cs="TH Sarabun New"/>
-                <w:sz w:val="24"/>
-                <w:szCs w:val="24"/>
-              </w:rPr>
-              <w:t>{{score</w:t>
-            </w:r>
-            <w:r>
-              <w:rPr>
-                <w:rFonts w:ascii="TH Sarabun New" w:hAnsi="TH Sarabun New" w:cs="TH Sarabun New"/>
-                <w:sz w:val="24"/>
-                <w:szCs w:val="24"/>
-              </w:rPr>
-              <w:t>2x</w:t>
-            </w:r>
-            <w:r>
-              <w:rPr>
-                <w:rFonts w:ascii="TH Sarabun New" w:hAnsi="TH Sarabun New" w:cs="TH Sarabun New"/>
-                <w:sz w:val="24"/>
-                <w:szCs w:val="24"/>
-              </w:rPr>
-              <w:t>}}</w:t>
-            </w:r>
-          </w:p>
-        </w:tc>
-        <w:tc>
-          <w:tcPr>
-            <w:tcW w:w="1701" w:type="dxa"/>
-          </w:tcPr>
-          <w:p>
-            <w:pPr>
-              <w:spacing w:after="0"/>
-              <w:rPr>
-                <w:rFonts w:ascii="TH Sarabun New" w:hAnsi="TH Sarabun New" w:cs="TH Sarabun New"/>
-                <w:sz w:val="20"/>
-                <w:szCs w:val="20"/>
-              </w:rPr>
-            </w:pPr>
-            <w:r>
-              <w:rPr>
-                <w:rFonts w:ascii="TH Sarabun New" w:hAnsi="TH Sarabun New" w:cs="TH Sarabun New"/>
-                <w:sz w:val="20"/>
-                <w:szCs w:val="20"/>
-                <w:cs/>
-              </w:rPr>
-              <w:t>-แผนการสอนและข้อมูลรายละเอียดของหัวข้อ/</w:t>
-            </w:r>
-            <w:r>
-              <w:rPr>
-                <w:rFonts w:ascii="TH Sarabun New" w:hAnsi="TH Sarabun New" w:cs="TH Sarabun New"/>
-                <w:sz w:val="20"/>
-                <w:szCs w:val="20"/>
-                <w:cs/>
-              </w:rPr>
-              <w:t xml:space="preserve"> </w:t>
-            </w:r>
-            <w:r>
-              <w:rPr>
-                <w:rFonts w:ascii="TH Sarabun New" w:hAnsi="TH Sarabun New" w:cs="TH Sarabun New"/>
-                <w:sz w:val="20"/>
-                <w:szCs w:val="20"/>
-                <w:cs/>
-              </w:rPr>
-              <w:t>วิชาที่สอน ในส่วนที่ผู้ขอเป็นผู้สอน</w:t>
-            </w:r>
-            <w:r>
-              <w:rPr>
-                <w:rFonts w:ascii="TH Sarabun New" w:hAnsi="TH Sarabun New" w:cs="TH Sarabun New"/>
-                <w:sz w:val="20"/>
-                <w:szCs w:val="20"/>
-                <w:cs/>
-              </w:rPr>
-              <w:t xml:space="preserve"> เช่น มคอ. ๓ มคอ.๕</w:t>
-            </w:r>
-            <w:r>
-              <w:rPr>
-                <w:rFonts w:ascii="TH Sarabun New" w:hAnsi="TH Sarabun New" w:cs="TH Sarabun New"/>
-                <w:sz w:val="20"/>
-                <w:szCs w:val="20"/>
-                <w:cs/>
-              </w:rPr>
-              <w:t>และ/หรือ แผนการสอนใน</w:t>
-            </w:r>
-            <w:r>
-              <w:rPr>
-                <w:rFonts w:ascii="TH Sarabun New" w:hAnsi="TH Sarabun New" w:cs="TH Sarabun New"/>
-                <w:sz w:val="20"/>
-                <w:szCs w:val="20"/>
-                <w:cs/>
-              </w:rPr>
-              <w:t>แบบฟอร์มอื่นที่กำหนดโดยส่วนงาน</w:t>
-            </w:r>
-          </w:p>
-          <w:p>
-            <w:pPr>
-              <w:spacing w:after="0"/>
-              <w:rPr>
-                <w:rFonts w:ascii="TH Sarabun New" w:hAnsi="TH Sarabun New" w:cs="TH Sarabun New"/>
-                <w:sz w:val="20"/>
-                <w:szCs w:val="20"/>
-                <w:cs/>
-              </w:rPr>
-            </w:pPr>
-            <w:r>
-              <w:rPr>
-                <w:rFonts w:ascii="TH Sarabun New" w:hAnsi="TH Sarabun New" w:cs="TH Sarabun New"/>
-                <w:sz w:val="20"/>
-                <w:szCs w:val="20"/>
-                <w:cs/>
-              </w:rPr>
-              <w:t>-</w:t>
-            </w:r>
-            <w:r>
-              <w:rPr>
-                <w:rFonts w:ascii="TH Sarabun New" w:hAnsi="TH Sarabun New" w:cs="TH Sarabun New"/>
-                <w:sz w:val="20"/>
-                <w:szCs w:val="20"/>
-                <w:cs/>
-              </w:rPr>
-              <w:t>ผลประเมินการสอนโดยนักศึกษาและ/</w:t>
-            </w:r>
-            <w:r>
-              <w:rPr>
-                <w:rFonts w:ascii="TH Sarabun New" w:hAnsi="TH Sarabun New" w:cs="TH Sarabun New"/>
-                <w:sz w:val="20"/>
-                <w:szCs w:val="20"/>
-                <w:cs/>
-              </w:rPr>
-              <w:t xml:space="preserve"> </w:t>
-            </w:r>
-            <w:r>
-              <w:rPr>
-                <w:rFonts w:ascii="TH Sarabun New" w:hAnsi="TH Sarabun New" w:cs="TH Sarabun New"/>
-                <w:sz w:val="20"/>
-                <w:szCs w:val="20"/>
-                <w:cs/>
-              </w:rPr>
-              <w:t>หรือผู้มีส่วนเกี่ยวข้อง และอื่น</w:t>
-            </w:r>
-            <w:r>
-              <w:rPr>
-                <w:rFonts w:ascii="TH Sarabun New" w:hAnsi="TH Sarabun New" w:cs="TH Sarabun New"/>
-                <w:sz w:val="20"/>
-                <w:szCs w:val="20"/>
-                <w:cs/>
-              </w:rPr>
-              <w:t xml:space="preserve"> </w:t>
-            </w:r>
-            <w:r>
-              <w:rPr>
-                <w:rFonts w:ascii="TH Sarabun New" w:hAnsi="TH Sarabun New" w:cs="TH Sarabun New"/>
-                <w:sz w:val="20"/>
-                <w:szCs w:val="20"/>
-                <w:cs/>
-              </w:rPr>
-              <w:t>ๆ</w:t>
-            </w:r>
-          </w:p>
-        </w:tc>
-      </w:tr>
-      <w:tr>
-        <w:trPr>
-          <w:trHeight w:val="1661"/>
-          <w:jc w:val="center"/>
-        </w:trPr>
-        <w:tc>
-          <w:tcPr>
-            <w:tcW w:w="421" w:type="dxa"/>
-          </w:tcPr>
-          <w:p>
-            <w:pPr>
-              <w:spacing w:after="0"/>
-              <w:jc w:val="center"/>
-              <w:rPr>
-                <w:rFonts w:ascii="TH Sarabun New" w:hAnsi="TH Sarabun New" w:cs="TH Sarabun New"/>
-                <w:sz w:val="24"/>
-                <w:szCs w:val="24"/>
-                <w:cs/>
-              </w:rPr>
-            </w:pPr>
-            <w:r>
-              <w:rPr>
-                <w:rFonts w:ascii="TH Sarabun New" w:hAnsi="TH Sarabun New" w:cs="TH Sarabun New"/>
-                <w:sz w:val="24"/>
-                <w:szCs w:val="24"/>
-                <w:cs/>
-              </w:rPr>
-              <w:t>๓</w:t>
-            </w:r>
-          </w:p>
-        </w:tc>
-        <w:tc>
-          <w:tcPr>
-            <w:tcW w:w="4541" w:type="dxa"/>
-          </w:tcPr>
-          <w:p>
-            <w:pPr>
-              <w:spacing w:after="0"/>
-              <w:rPr>
-                <w:rFonts w:ascii="TH Sarabun New" w:hAnsi="TH Sarabun New" w:cs="TH Sarabun New"/>
-                <w:sz w:val="24"/>
-                <w:szCs w:val="24"/>
-              </w:rPr>
-            </w:pPr>
-            <w:r>
-              <w:rPr>
-                <w:rFonts w:ascii="TH Sarabun New" w:hAnsi="TH Sarabun New" w:cs="TH Sarabun New"/>
-                <w:b/>
-                <w:bCs/>
-                <w:sz w:val="24"/>
-                <w:szCs w:val="24"/>
-                <w:cs/>
-              </w:rPr>
               <w:t>ความสามารถด้านการจัดการเรียนการสอน</w:t>
             </w:r>
             <w:r>
@@ -2380,7 +2212,7 @@
             <w:pPr>
               <w:spacing w:after="0"/>
               <w:rPr>
-                <w:rFonts w:ascii="TH Sarabun New" w:hAnsi="TH Sarabun New" w:cs="TH Sarabun New" w:hint="cs"/>
+                <w:rFonts w:ascii="TH Sarabun New" w:hAnsi="TH Sarabun New" w:cs="TH Sarabun New"/>
                 <w:sz w:val="24"/>
                 <w:szCs w:val="24"/>
                 <w:cs/>
@@ -2435,15 +2267,7 @@
                 <w:szCs w:val="24"/>
               </w:rPr>
               <w:lastRenderedPageBreak/>
-              <w:t>{{score</w:t>
-            </w:r>
-            <w:r>
-              <w:rPr>
-                <w:rFonts w:ascii="TH Sarabun New" w:hAnsi="TH Sarabun New" w:cs="TH Sarabun New"/>
-                <w:sz w:val="24"/>
-                <w:szCs w:val="24"/>
-              </w:rPr>
-              <w:t>3</w:t>
+              <w:t>{{score3</w:t>
             </w:r>
             <w:r>
               <w:rPr>
@@ -2483,23 +2307,7 @@
                 <w:sz w:val="24"/>
                 <w:szCs w:val="24"/>
               </w:rPr>
-              <w:t>{{score</w:t>
-            </w:r>
-            <w:r>
-              <w:rPr>
-                <w:rFonts w:ascii="TH Sarabun New" w:hAnsi="TH Sarabun New" w:cs="TH Sarabun New"/>
-                <w:sz w:val="24"/>
-                <w:szCs w:val="24"/>
-              </w:rPr>
-              <w:t>32</w:t>
-            </w:r>
-            <w:r>
-              <w:rPr>
-                <w:rFonts w:ascii="TH Sarabun New" w:hAnsi="TH Sarabun New" w:cs="TH Sarabun New"/>
-                <w:sz w:val="24"/>
-                <w:szCs w:val="24"/>
-              </w:rPr>
-              <w:t>}}</w:t>
+              <w:t>{{score32}}</w:t>
             </w:r>
           </w:p>
         </w:tc>
@@ -2523,23 +2331,7 @@
                 <w:sz w:val="24"/>
                 <w:szCs w:val="24"/>
               </w:rPr>
-              <w:t>{{score</w:t>
-            </w:r>
-            <w:r>
-              <w:rPr>
-                <w:rFonts w:ascii="TH Sarabun New" w:hAnsi="TH Sarabun New" w:cs="TH Sarabun New"/>
-                <w:sz w:val="24"/>
-                <w:szCs w:val="24"/>
-              </w:rPr>
-              <w:t>33</w:t>
-            </w:r>
-            <w:r>
-              <w:rPr>
-                <w:rFonts w:ascii="TH Sarabun New" w:hAnsi="TH Sarabun New" w:cs="TH Sarabun New"/>
-                <w:sz w:val="24"/>
-                <w:szCs w:val="24"/>
-              </w:rPr>
-              <w:t>}}</w:t>
+              <w:t>{{score33}}</w:t>
             </w:r>
           </w:p>
         </w:tc>
@@ -2563,23 +2355,7 @@
                 <w:sz w:val="24"/>
                 <w:szCs w:val="24"/>
               </w:rPr>
-              <w:t>{{score</w:t>
-            </w:r>
-            <w:r>
-              <w:rPr>
-                <w:rFonts w:ascii="TH Sarabun New" w:hAnsi="TH Sarabun New" w:cs="TH Sarabun New"/>
-                <w:sz w:val="24"/>
-                <w:szCs w:val="24"/>
-              </w:rPr>
-              <w:t>34</w:t>
-            </w:r>
-            <w:r>
-              <w:rPr>
-                <w:rFonts w:ascii="TH Sarabun New" w:hAnsi="TH Sarabun New" w:cs="TH Sarabun New"/>
-                <w:sz w:val="24"/>
-                <w:szCs w:val="24"/>
-              </w:rPr>
-              <w:t>}}</w:t>
+              <w:t>{{score34}}</w:t>
             </w:r>
           </w:p>
         </w:tc>
@@ -2603,23 +2379,7 @@
                 <w:sz w:val="24"/>
                 <w:szCs w:val="24"/>
               </w:rPr>
-              <w:t>{{score</w:t>
-            </w:r>
-            <w:r>
-              <w:rPr>
-                <w:rFonts w:ascii="TH Sarabun New" w:hAnsi="TH Sarabun New" w:cs="TH Sarabun New"/>
-                <w:sz w:val="24"/>
-                <w:szCs w:val="24"/>
-              </w:rPr>
-              <w:t>35</w:t>
-            </w:r>
-            <w:r>
-              <w:rPr>
-                <w:rFonts w:ascii="TH Sarabun New" w:hAnsi="TH Sarabun New" w:cs="TH Sarabun New"/>
-                <w:sz w:val="24"/>
-                <w:szCs w:val="24"/>
-              </w:rPr>
-              <w:t>}}</w:t>
+              <w:t>{{score35}}</w:t>
             </w:r>
           </w:p>
         </w:tc>
@@ -2670,23 +2430,7 @@
                 <w:sz w:val="24"/>
                 <w:szCs w:val="24"/>
               </w:rPr>
-              <w:t>{{score</w:t>
-            </w:r>
-            <w:r>
-              <w:rPr>
-                <w:rFonts w:ascii="TH Sarabun New" w:hAnsi="TH Sarabun New" w:cs="TH Sarabun New"/>
-                <w:sz w:val="24"/>
-                <w:szCs w:val="24"/>
-              </w:rPr>
-              <w:t>3x</w:t>
-            </w:r>
-            <w:r>
-              <w:rPr>
-                <w:rFonts w:ascii="TH Sarabun New" w:hAnsi="TH Sarabun New" w:cs="TH Sarabun New"/>
-                <w:sz w:val="24"/>
-                <w:szCs w:val="24"/>
-              </w:rPr>
-              <w:t>}}</w:t>
+              <w:t>{{score3x}}</w:t>
             </w:r>
           </w:p>
         </w:tc>
@@ -2963,15 +2707,7 @@
                 <w:sz w:val="24"/>
                 <w:szCs w:val="24"/>
               </w:rPr>
-              <w:t>{{score</w:t>
-            </w:r>
-            <w:r>
-              <w:rPr>
-                <w:rFonts w:ascii="TH Sarabun New" w:hAnsi="TH Sarabun New" w:cs="TH Sarabun New"/>
-                <w:sz w:val="24"/>
-                <w:szCs w:val="24"/>
-              </w:rPr>
-              <w:t>4</w:t>
+              <w:t>{{score4</w:t>
             </w:r>
             <w:r>
               <w:rPr>
@@ -3014,23 +2750,7 @@
                 <w:sz w:val="24"/>
                 <w:szCs w:val="24"/>
               </w:rPr>
-              <w:t>{{score</w:t>
-            </w:r>
-            <w:r>
-              <w:rPr>
-                <w:rFonts w:ascii="TH Sarabun New" w:hAnsi="TH Sarabun New" w:cs="TH Sarabun New"/>
-                <w:sz w:val="24"/>
-                <w:szCs w:val="24"/>
-              </w:rPr>
-              <w:t>42</w:t>
-            </w:r>
-            <w:r>
-              <w:rPr>
-                <w:rFonts w:ascii="TH Sarabun New" w:hAnsi="TH Sarabun New" w:cs="TH Sarabun New"/>
-                <w:sz w:val="24"/>
-                <w:szCs w:val="24"/>
-              </w:rPr>
-              <w:t>}}</w:t>
+              <w:t>{{score42}}</w:t>
             </w:r>
           </w:p>
         </w:tc>
@@ -3057,23 +2777,7 @@
                 <w:sz w:val="24"/>
                 <w:szCs w:val="24"/>
               </w:rPr>
-              <w:t>{{score</w:t>
-            </w:r>
-            <w:r>
-              <w:rPr>
-                <w:rFonts w:ascii="TH Sarabun New" w:hAnsi="TH Sarabun New" w:cs="TH Sarabun New"/>
-                <w:sz w:val="24"/>
-                <w:szCs w:val="24"/>
-              </w:rPr>
-              <w:t>43</w:t>
-            </w:r>
-            <w:r>
-              <w:rPr>
-                <w:rFonts w:ascii="TH Sarabun New" w:hAnsi="TH Sarabun New" w:cs="TH Sarabun New"/>
-                <w:sz w:val="24"/>
-                <w:szCs w:val="24"/>
-              </w:rPr>
-              <w:t>}}</w:t>
+              <w:t>{{score43}}</w:t>
             </w:r>
           </w:p>
         </w:tc>
@@ -3100,23 +2804,7 @@
                 <w:sz w:val="24"/>
                 <w:szCs w:val="24"/>
               </w:rPr>
-              <w:t>{{score</w:t>
-            </w:r>
-            <w:r>
-              <w:rPr>
-                <w:rFonts w:ascii="TH Sarabun New" w:hAnsi="TH Sarabun New" w:cs="TH Sarabun New"/>
-                <w:sz w:val="24"/>
-                <w:szCs w:val="24"/>
-              </w:rPr>
-              <w:t>44</w:t>
-            </w:r>
-            <w:r>
-              <w:rPr>
-                <w:rFonts w:ascii="TH Sarabun New" w:hAnsi="TH Sarabun New" w:cs="TH Sarabun New"/>
-                <w:sz w:val="24"/>
-                <w:szCs w:val="24"/>
-              </w:rPr>
-              <w:t>}}</w:t>
+              <w:t>{{score44}}</w:t>
             </w:r>
           </w:p>
         </w:tc>
@@ -3143,23 +2831,7 @@
                 <w:sz w:val="24"/>
                 <w:szCs w:val="24"/>
               </w:rPr>
-              <w:t>{{score</w:t>
-            </w:r>
-            <w:r>
-              <w:rPr>
-                <w:rFonts w:ascii="TH Sarabun New" w:hAnsi="TH Sarabun New" w:cs="TH Sarabun New"/>
-                <w:sz w:val="24"/>
-                <w:szCs w:val="24"/>
-              </w:rPr>
-              <w:t>45</w:t>
-            </w:r>
-            <w:r>
-              <w:rPr>
-                <w:rFonts w:ascii="TH Sarabun New" w:hAnsi="TH Sarabun New" w:cs="TH Sarabun New"/>
-                <w:sz w:val="24"/>
-                <w:szCs w:val="24"/>
-              </w:rPr>
-              <w:t>}}</w:t>
+              <w:t>{{score45}}</w:t>
             </w:r>
           </w:p>
         </w:tc>
@@ -3216,23 +2888,7 @@
                 <w:sz w:val="24"/>
                 <w:szCs w:val="24"/>
               </w:rPr>
-              <w:t>{{score</w:t>
-            </w:r>
-            <w:r>
-              <w:rPr>
-                <w:rFonts w:ascii="TH Sarabun New" w:hAnsi="TH Sarabun New" w:cs="TH Sarabun New"/>
-                <w:sz w:val="24"/>
-                <w:szCs w:val="24"/>
-              </w:rPr>
-              <w:t>4x</w:t>
-            </w:r>
-            <w:r>
-              <w:rPr>
-                <w:rFonts w:ascii="TH Sarabun New" w:hAnsi="TH Sarabun New" w:cs="TH Sarabun New"/>
-                <w:sz w:val="24"/>
-                <w:szCs w:val="24"/>
-              </w:rPr>
-              <w:t>}}</w:t>
+              <w:t>{{score4x}}</w:t>
             </w:r>
           </w:p>
         </w:tc>
@@ -3304,7 +2960,7 @@
       </w:tr>
       <w:tr>
         <w:trPr>
-          <w:trHeight w:val="143"/>
+          <w:trHeight w:val="399"/>
           <w:jc w:val="center"/>
         </w:trPr>
         <w:tc>
@@ -3522,7 +3178,25 @@
                 <w:sz w:val="24"/>
                 <w:szCs w:val="24"/>
               </w:rPr>
-              <w:t>{{scorex}}</w:t>
+              <w:t>{{</w:t>
+            </w:r>
+            <w:proofErr w:type="spellStart"/>
+            <w:r>
+              <w:rPr>
+                <w:rFonts w:ascii="TH Sarabun New" w:hAnsi="TH Sarabun New" w:cs="TH Sarabun New"/>
+                <w:sz w:val="24"/>
+                <w:szCs w:val="24"/>
+              </w:rPr>
+              <w:t>scorex</w:t>
+            </w:r>
+            <w:proofErr w:type="spellEnd"/>
+            <w:r>
+              <w:rPr>
+                <w:rFonts w:ascii="TH Sarabun New" w:hAnsi="TH Sarabun New" w:cs="TH Sarabun New"/>
+                <w:sz w:val="24"/>
+                <w:szCs w:val="24"/>
+              </w:rPr>
+              <w:t>}}</w:t>
             </w:r>
           </w:p>
         </w:tc>
@@ -3634,6 +3308,152 @@
     <w:p>
       <w:pPr>
         <w:spacing w:after="0"/>
+        <w:jc w:val="right"/>
+        <w:rPr>
+          <w:rFonts w:ascii="TH Sarabun New" w:hAnsi="TH Sarabun New" w:cs="TH Sarabun New"/>
+          <w:sz w:val="20"/>
+          <w:szCs w:val="20"/>
+        </w:rPr>
+      </w:pPr>
+      <w:r>
+        <w:rPr>
+          <w:rFonts w:ascii="TH Sarabun New" w:hAnsi="TH Sarabun New" w:cs="TH Sarabun New"/>
+          <w:sz w:val="20"/>
+          <w:szCs w:val="20"/>
+        </w:rPr>
+        <w:t>{{ch1}}</w:t>
+      </w:r>
+      <w:r>
+        <w:rPr>
+          <w:rFonts w:ascii="TH Sarabun New" w:hAnsi="TH Sarabun New" w:cs="TH Sarabun New"/>
+          <w:sz w:val="20"/>
+          <w:szCs w:val="20"/>
+          <w:cs/>
+        </w:rPr>
+        <w:t xml:space="preserve"> ไม่ผ่าน</w:t>
+      </w:r>
+      <w:proofErr w:type="gramStart"/>
+      <w:r>
+        <w:rPr>
+          <w:rFonts w:ascii="TH Sarabun New" w:hAnsi="TH Sarabun New" w:cs="TH Sarabun New"/>
+          <w:sz w:val="20"/>
+          <w:szCs w:val="20"/>
+          <w:cs/>
+        </w:rPr>
+        <w:t xml:space="preserve">   </w:t>
+      </w:r>
+      <w:r>
+        <w:rPr>
+          <w:rFonts w:ascii="TH Sarabun New" w:hAnsi="TH Sarabun New" w:cs="TH Sarabun New"/>
+          <w:sz w:val="20"/>
+          <w:szCs w:val="20"/>
+        </w:rPr>
+        <w:t>{</w:t>
+      </w:r>
+      <w:proofErr w:type="gramEnd"/>
+      <w:r>
+        <w:rPr>
+          <w:rFonts w:ascii="TH Sarabun New" w:hAnsi="TH Sarabun New" w:cs="TH Sarabun New"/>
+          <w:sz w:val="20"/>
+          <w:szCs w:val="20"/>
+        </w:rPr>
+        <w:t>{ch2}}</w:t>
+      </w:r>
+      <w:r>
+        <w:rPr>
+          <w:rFonts w:ascii="TH Sarabun New" w:hAnsi="TH Sarabun New" w:cs="TH Sarabun New"/>
+          <w:sz w:val="20"/>
+          <w:szCs w:val="20"/>
+          <w:cs/>
+        </w:rPr>
+        <w:t xml:space="preserve"> </w:t>
+      </w:r>
+      <w:proofErr w:type="gramStart"/>
+      <w:r>
+        <w:rPr>
+          <w:rFonts w:ascii="TH Sarabun New" w:hAnsi="TH Sarabun New" w:cs="TH Sarabun New"/>
+          <w:sz w:val="20"/>
+          <w:szCs w:val="20"/>
+          <w:cs/>
+        </w:rPr>
+        <w:t xml:space="preserve">ชำนาญ  </w:t>
+      </w:r>
+      <w:r>
+        <w:rPr>
+          <w:rFonts w:ascii="TH Sarabun New" w:hAnsi="TH Sarabun New" w:cs="TH Sarabun New"/>
+          <w:sz w:val="20"/>
+          <w:szCs w:val="20"/>
+        </w:rPr>
+        <w:t>{</w:t>
+      </w:r>
+      <w:proofErr w:type="gramEnd"/>
+      <w:r>
+        <w:rPr>
+          <w:rFonts w:ascii="TH Sarabun New" w:hAnsi="TH Sarabun New" w:cs="TH Sarabun New"/>
+          <w:sz w:val="20"/>
+          <w:szCs w:val="20"/>
+        </w:rPr>
+        <w:t>{ch3}}</w:t>
+      </w:r>
+      <w:r>
+        <w:rPr>
+          <w:rFonts w:ascii="TH Sarabun New" w:hAnsi="TH Sarabun New" w:cs="TH Sarabun New"/>
+          <w:sz w:val="20"/>
+          <w:szCs w:val="20"/>
+          <w:cs/>
+        </w:rPr>
+        <w:t xml:space="preserve"> ชำนาญพิเศษ</w:t>
+      </w:r>
+      <w:proofErr w:type="gramStart"/>
+      <w:r>
+        <w:rPr>
+          <w:rFonts w:ascii="TH Sarabun New" w:hAnsi="TH Sarabun New" w:cs="TH Sarabun New"/>
+          <w:sz w:val="20"/>
+          <w:szCs w:val="20"/>
+          <w:cs/>
+        </w:rPr>
+        <w:t xml:space="preserve">   </w:t>
+      </w:r>
+      <w:r>
+        <w:rPr>
+          <w:rFonts w:ascii="TH Sarabun New" w:hAnsi="TH Sarabun New" w:cs="TH Sarabun New"/>
+          <w:sz w:val="20"/>
+          <w:szCs w:val="20"/>
+        </w:rPr>
+        <w:t>{</w:t>
+      </w:r>
+      <w:proofErr w:type="gramEnd"/>
+      <w:r>
+        <w:rPr>
+          <w:rFonts w:ascii="TH Sarabun New" w:hAnsi="TH Sarabun New" w:cs="TH Sarabun New"/>
+          <w:sz w:val="20"/>
+          <w:szCs w:val="20"/>
+        </w:rPr>
+        <w:t>{ch3</w:t>
+      </w:r>
+      <w:proofErr w:type="gramStart"/>
+      <w:r>
+        <w:rPr>
+          <w:rFonts w:ascii="TH Sarabun New" w:hAnsi="TH Sarabun New" w:cs="TH Sarabun New"/>
+          <w:sz w:val="20"/>
+          <w:szCs w:val="20"/>
+        </w:rPr>
+        <w:t>}}</w:t>
+      </w:r>
+      <w:r>
+        <w:rPr>
+          <w:rFonts w:ascii="TH Sarabun New" w:hAnsi="TH Sarabun New" w:cs="TH Sarabun New"/>
+          <w:sz w:val="20"/>
+          <w:szCs w:val="20"/>
+          <w:cs/>
+        </w:rPr>
+        <w:t>เชี่ยวชาญ</w:t>
+      </w:r>
+      <w:proofErr w:type="gramEnd"/>
+    </w:p>
+    <w:p>
+      <w:pPr>
+        <w:spacing w:after="0"/>
         <w:rPr>
           <w:rFonts w:ascii="TH Sarabun New" w:hAnsi="TH Sarabun New" w:cs="TH Sarabun New"/>
           <w:sz w:val="20"/>
@@ -3664,7 +3484,78 @@
           <w:sz w:val="24"/>
           <w:szCs w:val="24"/>
         </w:rPr>
-        <w:t>{{score</w:t>
+        <w:t>{{score1x}}</w:t>
+      </w:r>
+      <w:r>
+        <w:rPr>
+          <w:rFonts w:ascii="TH Sarabun New" w:hAnsi="TH Sarabun New" w:cs="TH Sarabun New"/>
+          <w:sz w:val="20"/>
+          <w:szCs w:val="20"/>
+          <w:cs/>
+        </w:rPr>
+        <w:t>คะแนน</w:t>
+      </w:r>
+      <w:r>
+        <w:rPr>
+          <w:rFonts w:ascii="TH Sarabun New" w:hAnsi="TH Sarabun New" w:cs="TH Sarabun New"/>
+          <w:sz w:val="20"/>
+          <w:szCs w:val="20"/>
+          <w:cs/>
+        </w:rPr>
+        <w:t xml:space="preserve"> </w:t>
+      </w:r>
+      <w:r>
+        <w:rPr>
+          <w:rFonts w:ascii="TH Sarabun New" w:hAnsi="TH Sarabun New" w:cs="TH Sarabun New"/>
+          <w:sz w:val="20"/>
+          <w:szCs w:val="20"/>
+        </w:rPr>
+        <w:t xml:space="preserve">               </w:t>
+      </w:r>
+      <w:r>
+        <w:rPr>
+          <w:rFonts w:ascii="TH Sarabun New" w:hAnsi="TH Sarabun New" w:cs="TH Sarabun New"/>
+          <w:sz w:val="20"/>
+          <w:szCs w:val="20"/>
+        </w:rPr>
+        <w:tab/>
+      </w:r>
+      <w:r>
+        <w:rPr>
+          <w:rFonts w:ascii="TH Sarabun New" w:hAnsi="TH Sarabun New" w:cs="TH Sarabun New"/>
+          <w:sz w:val="20"/>
+          <w:szCs w:val="20"/>
+        </w:rPr>
+        <w:tab/>
+        <w:t xml:space="preserve"> </w:t>
+      </w:r>
+    </w:p>
+    <w:p>
+      <w:pPr>
+        <w:spacing w:after="0"/>
+        <w:rPr>
+          <w:rFonts w:ascii="TH Sarabun New" w:hAnsi="TH Sarabun New" w:cs="TH Sarabun New"/>
+          <w:sz w:val="20"/>
+          <w:szCs w:val="20"/>
+          <w:cs/>
+        </w:rPr>
+      </w:pPr>
+      <w:r>
+        <w:rPr>
+          <w:rFonts w:ascii="TH Sarabun New" w:hAnsi="TH Sarabun New" w:cs="TH Sarabun New"/>
+          <w:sz w:val="20"/>
+          <w:szCs w:val="20"/>
+          <w:cs/>
+        </w:rPr>
+        <w:t>๒. ความสามารถด้านการวางแผนการสอนและการประเมินผลการเรียนการสอน</w:t>
+      </w:r>
+      <w:r>
+        <w:rPr>
+          <w:rFonts w:ascii="TH Sarabun New" w:hAnsi="TH Sarabun New" w:cs="TH Sarabun New"/>
+          <w:sz w:val="20"/>
+          <w:szCs w:val="20"/>
+        </w:rPr>
+        <w:tab/>
       </w:r>
       <w:r>
         <w:rPr>
@@ -3672,7 +3563,70 @@
           <w:sz w:val="24"/>
           <w:szCs w:val="24"/>
         </w:rPr>
-        <w:t>1</w:t>
+        <w:t>{{score2x}}</w:t>
+      </w:r>
+      <w:r>
+        <w:rPr>
+          <w:rFonts w:ascii="TH Sarabun New" w:hAnsi="TH Sarabun New" w:cs="TH Sarabun New"/>
+          <w:sz w:val="20"/>
+          <w:szCs w:val="20"/>
+        </w:rPr>
+        <w:t xml:space="preserve"> </w:t>
+      </w:r>
+      <w:r>
+        <w:rPr>
+          <w:rFonts w:ascii="TH Sarabun New" w:hAnsi="TH Sarabun New" w:cs="TH Sarabun New"/>
+          <w:sz w:val="20"/>
+          <w:szCs w:val="20"/>
+          <w:cs/>
+        </w:rPr>
+        <w:t>คะแนน</w:t>
+      </w:r>
+    </w:p>
+    <w:p>
+      <w:pPr>
+        <w:spacing w:after="0"/>
+        <w:rPr>
+          <w:rFonts w:ascii="TH Sarabun New" w:hAnsi="TH Sarabun New" w:cs="TH Sarabun New"/>
+          <w:sz w:val="20"/>
+          <w:szCs w:val="20"/>
+        </w:rPr>
+      </w:pPr>
+      <w:r>
+        <w:rPr>
+          <w:rFonts w:ascii="TH Sarabun New" w:hAnsi="TH Sarabun New" w:cs="TH Sarabun New"/>
+          <w:sz w:val="20"/>
+          <w:szCs w:val="20"/>
+          <w:cs/>
+        </w:rPr>
+        <w:t>๓. ความสามารถด้านการจัดการเรียนการสอน</w:t>
+      </w:r>
+      <w:r>
+        <w:rPr>
+          <w:rFonts w:ascii="TH Sarabun New" w:hAnsi="TH Sarabun New" w:cs="TH Sarabun New"/>
+          <w:sz w:val="20"/>
+          <w:szCs w:val="20"/>
+          <w:cs/>
+        </w:rPr>
+        <w:tab/>
+      </w:r>
+      <w:r>
+        <w:rPr>
+          <w:rFonts w:ascii="TH Sarabun New" w:hAnsi="TH Sarabun New" w:cs="TH Sarabun New"/>
+          <w:sz w:val="20"/>
+          <w:szCs w:val="20"/>
+          <w:cs/>
+        </w:rPr>
+        <w:tab/>
+      </w:r>
+      <w:r>
+        <w:rPr>
+          <w:rFonts w:ascii="TH Sarabun New" w:hAnsi="TH Sarabun New" w:cs="TH Sarabun New"/>
+          <w:sz w:val="20"/>
+          <w:szCs w:val="20"/>
+          <w:cs/>
+        </w:rPr>
+        <w:tab/>
       </w:r>
       <w:r>
         <w:rPr>
@@ -3680,7 +3634,16 @@
           <w:sz w:val="24"/>
           <w:szCs w:val="24"/>
         </w:rPr>
-        <w:t>x}}</w:t>
+        <w:t>{{score3x}}</w:t>
+      </w:r>
+      <w:r>
+        <w:rPr>
+          <w:rFonts w:ascii="TH Sarabun New" w:hAnsi="TH Sarabun New" w:cs="TH Sarabun New" w:hint="cs"/>
+          <w:sz w:val="20"/>
+          <w:szCs w:val="20"/>
+          <w:cs/>
+        </w:rPr>
+        <w:t xml:space="preserve"> </w:t>
       </w:r>
       <w:r>
         <w:rPr>
@@ -3690,101 +3653,6 @@
           <w:cs/>
         </w:rPr>
         <w:t>คะแนน</w:t>
-      </w:r>
-      <w:r>
-        <w:rPr>
-          <w:rFonts w:ascii="TH Sarabun New" w:hAnsi="TH Sarabun New" w:cs="TH Sarabun New"/>
-          <w:sz w:val="20"/>
-          <w:szCs w:val="20"/>
-          <w:cs/>
-        </w:rPr>
-        <w:t xml:space="preserve">          </w:t>
-      </w:r>
-      <w:r>
-        <w:rPr>
-          <w:rFonts w:ascii="TH Sarabun New" w:hAnsi="TH Sarabun New" w:cs="TH Sarabun New"/>
-          <w:sz w:val="20"/>
-          <w:szCs w:val="20"/>
-        </w:rPr>
-        <w:sym w:font="Wingdings 2" w:char="F0A3"/>
-      </w:r>
-      <w:r>
-        <w:rPr>
-          <w:rFonts w:ascii="TH Sarabun New" w:hAnsi="TH Sarabun New" w:cs="TH Sarabun New"/>
-          <w:sz w:val="20"/>
-          <w:szCs w:val="20"/>
-          <w:cs/>
-        </w:rPr>
-        <w:t xml:space="preserve"> ไม่ผ่าน </w:t>
-      </w:r>
-      <w:r>
-        <w:rPr>
-          <w:rFonts w:ascii="TH Sarabun New" w:hAnsi="TH Sarabun New" w:cs="TH Sarabun New"/>
-          <w:sz w:val="20"/>
-          <w:szCs w:val="20"/>
-          <w:cs/>
-        </w:rPr>
-        <w:t xml:space="preserve">  </w:t>
-      </w:r>
-      <w:r>
-        <w:rPr>
-          <w:rFonts w:ascii="TH Sarabun New" w:hAnsi="TH Sarabun New" w:cs="TH Sarabun New"/>
-          <w:sz w:val="20"/>
-          <w:szCs w:val="20"/>
-        </w:rPr>
-        <w:sym w:font="Wingdings 2" w:char="F0A3"/>
-      </w:r>
-      <w:r>
-        <w:rPr>
-          <w:rFonts w:ascii="TH Sarabun New" w:hAnsi="TH Sarabun New" w:cs="TH Sarabun New"/>
-          <w:sz w:val="20"/>
-          <w:szCs w:val="20"/>
-          <w:cs/>
-        </w:rPr>
-        <w:t xml:space="preserve"> ชำนาญ</w:t>
-      </w:r>
-      <w:r>
-        <w:rPr>
-          <w:rFonts w:ascii="TH Sarabun New" w:hAnsi="TH Sarabun New" w:cs="TH Sarabun New"/>
-          <w:sz w:val="20"/>
-          <w:szCs w:val="20"/>
-          <w:cs/>
-        </w:rPr>
-        <w:t xml:space="preserve">    </w:t>
-      </w:r>
-      <w:r>
-        <w:rPr>
-          <w:rFonts w:ascii="TH Sarabun New" w:hAnsi="TH Sarabun New" w:cs="TH Sarabun New"/>
-          <w:sz w:val="20"/>
-          <w:szCs w:val="20"/>
-        </w:rPr>
-        <w:sym w:font="Wingdings 2" w:char="F0A3"/>
-      </w:r>
-      <w:r>
-        <w:rPr>
-          <w:rFonts w:ascii="TH Sarabun New" w:hAnsi="TH Sarabun New" w:cs="TH Sarabun New"/>
-          <w:sz w:val="20"/>
-          <w:szCs w:val="20"/>
-          <w:cs/>
-        </w:rPr>
-        <w:t xml:space="preserve"> ชำนาญพิเศษ   </w:t>
-      </w:r>
-      <w:r>
-        <w:rPr>
-          <w:rFonts w:ascii="TH Sarabun New" w:hAnsi="TH Sarabun New" w:cs="TH Sarabun New"/>
-          <w:sz w:val="20"/>
-          <w:szCs w:val="20"/>
-        </w:rPr>
-        <w:sym w:font="Wingdings 2" w:char="F0A3"/>
-      </w:r>
-      <w:r>
-        <w:rPr>
-          <w:rFonts w:ascii="TH Sarabun New" w:hAnsi="TH Sarabun New" w:cs="TH Sarabun New"/>
-          <w:sz w:val="20"/>
-          <w:szCs w:val="20"/>
-          <w:cs/>
-        </w:rPr>
-        <w:t xml:space="preserve"> เชี่ยวชาญ</w:t>
       </w:r>
     </w:p>
     <w:p>
@@ -3795,232 +3663,6 @@
           <w:sz w:val="20"/>
           <w:szCs w:val="20"/>
           <w:cs/>
-        </w:rPr>
-      </w:pPr>
-      <w:r>
-        <w:rPr>
-          <w:rFonts w:ascii="TH Sarabun New" w:hAnsi="TH Sarabun New" w:cs="TH Sarabun New"/>
-          <w:sz w:val="20"/>
-          <w:szCs w:val="20"/>
-          <w:cs/>
-        </w:rPr>
-        <w:t>๒. ความสามารถด้านการวางแผนการสอนและการประเมินผลการเรียนการสอน</w:t>
-      </w:r>
-      <w:r>
-        <w:rPr>
-          <w:rFonts w:ascii="TH Sarabun New" w:hAnsi="TH Sarabun New" w:cs="TH Sarabun New"/>
-          <w:sz w:val="20"/>
-          <w:szCs w:val="20"/>
-        </w:rPr>
-        <w:tab/>
-      </w:r>
-      <w:r>
-        <w:rPr>
-          <w:rFonts w:ascii="TH Sarabun New" w:hAnsi="TH Sarabun New" w:cs="TH Sarabun New"/>
-          <w:sz w:val="24"/>
-          <w:szCs w:val="24"/>
-        </w:rPr>
-        <w:t>{{score</w:t>
-      </w:r>
-      <w:r>
-        <w:rPr>
-          <w:rFonts w:ascii="TH Sarabun New" w:hAnsi="TH Sarabun New" w:cs="TH Sarabun New"/>
-          <w:sz w:val="24"/>
-          <w:szCs w:val="24"/>
-        </w:rPr>
-        <w:t>2</w:t>
-      </w:r>
-      <w:r>
-        <w:rPr>
-          <w:rFonts w:ascii="TH Sarabun New" w:hAnsi="TH Sarabun New" w:cs="TH Sarabun New"/>
-          <w:sz w:val="24"/>
-          <w:szCs w:val="24"/>
-        </w:rPr>
-        <w:t>x}}</w:t>
-      </w:r>
-      <w:r>
-        <w:rPr>
-          <w:rFonts w:ascii="TH Sarabun New" w:hAnsi="TH Sarabun New" w:cs="TH Sarabun New"/>
-          <w:sz w:val="20"/>
-          <w:szCs w:val="20"/>
-        </w:rPr>
-        <w:t xml:space="preserve"> </w:t>
-      </w:r>
-      <w:r>
-        <w:rPr>
-          <w:rFonts w:ascii="TH Sarabun New" w:hAnsi="TH Sarabun New" w:cs="TH Sarabun New"/>
-          <w:sz w:val="20"/>
-          <w:szCs w:val="20"/>
-          <w:cs/>
-        </w:rPr>
-        <w:t>คะแนน</w:t>
-      </w:r>
-    </w:p>
-    <w:p>
-      <w:pPr>
-        <w:spacing w:after="0"/>
-        <w:rPr>
-          <w:rFonts w:ascii="TH Sarabun New" w:hAnsi="TH Sarabun New" w:cs="TH Sarabun New"/>
-          <w:sz w:val="20"/>
-          <w:szCs w:val="20"/>
-        </w:rPr>
-      </w:pPr>
-      <w:r>
-        <w:rPr>
-          <w:rFonts w:ascii="TH Sarabun New" w:hAnsi="TH Sarabun New" w:cs="TH Sarabun New"/>
-          <w:sz w:val="20"/>
-          <w:szCs w:val="20"/>
-          <w:cs/>
-        </w:rPr>
-        <w:t>๓. ความสามารถด้านการจัดการเรียนการสอน</w:t>
-      </w:r>
-      <w:r>
-        <w:rPr>
-          <w:rFonts w:ascii="TH Sarabun New" w:hAnsi="TH Sarabun New" w:cs="TH Sarabun New"/>
-          <w:sz w:val="20"/>
-          <w:szCs w:val="20"/>
-          <w:cs/>
-        </w:rPr>
-        <w:tab/>
-      </w:r>
-      <w:r>
-        <w:rPr>
-          <w:rFonts w:ascii="TH Sarabun New" w:hAnsi="TH Sarabun New" w:cs="TH Sarabun New"/>
-          <w:sz w:val="20"/>
-          <w:szCs w:val="20"/>
-          <w:cs/>
-        </w:rPr>
-        <w:tab/>
-      </w:r>
-      <w:r>
-        <w:rPr>
-          <w:rFonts w:ascii="TH Sarabun New" w:hAnsi="TH Sarabun New" w:cs="TH Sarabun New"/>
-          <w:sz w:val="20"/>
-          <w:szCs w:val="20"/>
-          <w:cs/>
-        </w:rPr>
-        <w:tab/>
-      </w:r>
-      <w:r>
-        <w:rPr>
-          <w:rFonts w:ascii="TH Sarabun New" w:hAnsi="TH Sarabun New" w:cs="TH Sarabun New"/>
-          <w:sz w:val="24"/>
-          <w:szCs w:val="24"/>
-        </w:rPr>
-        <w:t>{{score</w:t>
-      </w:r>
-      <w:r>
-        <w:rPr>
-          <w:rFonts w:ascii="TH Sarabun New" w:hAnsi="TH Sarabun New" w:cs="TH Sarabun New"/>
-          <w:sz w:val="24"/>
-          <w:szCs w:val="24"/>
-        </w:rPr>
-        <w:t>3</w:t>
-      </w:r>
-      <w:r>
-        <w:rPr>
-          <w:rFonts w:ascii="TH Sarabun New" w:hAnsi="TH Sarabun New" w:cs="TH Sarabun New"/>
-          <w:sz w:val="24"/>
-          <w:szCs w:val="24"/>
-        </w:rPr>
-        <w:t>x}}</w:t>
-      </w:r>
-      <w:r>
-        <w:rPr>
-          <w:rFonts w:ascii="TH Sarabun New" w:hAnsi="TH Sarabun New" w:cs="TH Sarabun New" w:hint="cs"/>
-          <w:sz w:val="20"/>
-          <w:szCs w:val="20"/>
-          <w:cs/>
-        </w:rPr>
-        <w:t xml:space="preserve"> </w:t>
-      </w:r>
-      <w:r>
-        <w:rPr>
-          <w:rFonts w:ascii="TH Sarabun New" w:hAnsi="TH Sarabun New" w:cs="TH Sarabun New"/>
-          <w:sz w:val="20"/>
-          <w:szCs w:val="20"/>
-          <w:cs/>
-        </w:rPr>
-        <w:t>คะแนน</w:t>
-      </w:r>
-    </w:p>
-    <w:p>
-      <w:pPr>
-        <w:spacing w:after="0"/>
-        <w:rPr>
-          <w:rFonts w:ascii="TH Sarabun New" w:hAnsi="TH Sarabun New" w:cs="TH Sarabun New"/>
-          <w:sz w:val="20"/>
-          <w:szCs w:val="20"/>
-          <w:cs/>
-        </w:rPr>
-      </w:pPr>
-      <w:r>
-        <w:rPr>
-          <w:rFonts w:ascii="TH Sarabun New" w:hAnsi="TH Sarabun New" w:cs="TH Sarabun New"/>
-          <w:sz w:val="20"/>
-          <w:szCs w:val="20"/>
-          <w:cs/>
-        </w:rPr>
-        <w:t>๔. ความเป็นผู้มีคุณธรรมจริยธรรม และวิญญาณความเป็นครู</w:t>
-      </w:r>
-      <w:r>
-        <w:rPr>
-          <w:rFonts w:ascii="TH Sarabun New" w:hAnsi="TH Sarabun New" w:cs="TH Sarabun New"/>
-          <w:sz w:val="20"/>
-          <w:szCs w:val="20"/>
-        </w:rPr>
-        <w:tab/>
-      </w:r>
-      <w:r>
-        <w:rPr>
-          <w:rFonts w:ascii="TH Sarabun New" w:hAnsi="TH Sarabun New" w:cs="TH Sarabun New"/>
-          <w:sz w:val="20"/>
-          <w:szCs w:val="20"/>
-        </w:rPr>
-        <w:tab/>
-      </w:r>
-      <w:r>
-        <w:rPr>
-          <w:rFonts w:ascii="TH Sarabun New" w:hAnsi="TH Sarabun New" w:cs="TH Sarabun New"/>
-          <w:sz w:val="24"/>
-          <w:szCs w:val="24"/>
-        </w:rPr>
-        <w:t>{{score4x}}</w:t>
-      </w:r>
-      <w:r>
-        <w:rPr>
-          <w:rFonts w:ascii="TH Sarabun New" w:hAnsi="TH Sarabun New" w:cs="TH Sarabun New" w:hint="cs"/>
-          <w:sz w:val="20"/>
-          <w:szCs w:val="20"/>
-          <w:cs/>
-        </w:rPr>
-        <w:t xml:space="preserve"> </w:t>
-      </w:r>
-      <w:r>
-        <w:rPr>
-          <w:rFonts w:ascii="TH Sarabun New" w:hAnsi="TH Sarabun New" w:cs="TH Sarabun New"/>
-          <w:sz w:val="20"/>
-          <w:szCs w:val="20"/>
-          <w:cs/>
-        </w:rPr>
-        <w:t xml:space="preserve">คะแนน </w:t>
-      </w:r>
-      <w:r>
-        <w:rPr>
-          <w:rFonts w:ascii="TH Sarabun New" w:hAnsi="TH Sarabun New" w:cs="TH Sarabun New"/>
-          <w:sz w:val="20"/>
-          <w:szCs w:val="20"/>
-          <w:cs/>
-        </w:rPr>
-        <w:tab/>
-      </w:r>
-    </w:p>
-    <w:p>
-      <w:pPr>
-        <w:rPr>
-          <w:rFonts w:ascii="TH Sarabun New" w:hAnsi="TH Sarabun New" w:cs="TH Sarabun New"/>
-          <w:sz w:val="20"/>
-          <w:szCs w:val="20"/>
         </w:rPr>
       </w:pPr>
       <w:r>
@@ -4034,13 +3676,13 @@
         <mc:AlternateContent>
           <mc:Choice Requires="wps">
             <w:drawing>
-              <wp:anchor distT="45720" distB="45720" distL="114300" distR="114300" simplePos="0" relativeHeight="251679744" behindDoc="0" locked="0" layoutInCell="1" allowOverlap="1" wp14:anchorId="4A59BA1E" wp14:editId="579143B8">
+              <wp:anchor distT="45720" distB="45720" distL="114300" distR="114300" simplePos="0" relativeHeight="251679744" behindDoc="0" locked="0" layoutInCell="1" allowOverlap="1" wp14:anchorId="4A59BA1E" wp14:editId="5A7E5F41">
                 <wp:simplePos x="0" y="0"/>
                 <wp:positionH relativeFrom="margin">
-                  <wp:posOffset>3370997</wp:posOffset>
+                  <wp:posOffset>3624580</wp:posOffset>
                 </wp:positionH>
                 <wp:positionV relativeFrom="paragraph">
-                  <wp:posOffset>182160</wp:posOffset>
+                  <wp:posOffset>64770</wp:posOffset>
                 </wp:positionV>
                 <wp:extent cx="2763672" cy="1828800"/>
                 <wp:effectExtent l="0" t="0" r="0" b="0"/>
@@ -4188,23 +3830,7 @@
                                 <w:sz w:val="24"/>
                                 <w:szCs w:val="24"/>
                               </w:rPr>
-                              <w:t>{{committee</w:t>
-                            </w:r>
-                            <w:r>
-                              <w:rPr>
-                                <w:rFonts w:ascii="TH Sarabun New" w:hAnsi="TH Sarabun New" w:cs="TH Sarabun New"/>
-                                <w:sz w:val="24"/>
-                                <w:szCs w:val="24"/>
-                              </w:rPr>
-                              <w:t>2</w:t>
-                            </w:r>
-                            <w:r>
-                              <w:rPr>
-                                <w:rFonts w:ascii="TH Sarabun New" w:hAnsi="TH Sarabun New" w:cs="TH Sarabun New"/>
-                                <w:sz w:val="24"/>
-                                <w:szCs w:val="24"/>
-                              </w:rPr>
-                              <w:t>}}</w:t>
+                              <w:t>{{committee2}}</w:t>
                             </w:r>
                             <w:r>
                               <w:rPr>
@@ -4272,23 +3898,7 @@
                                 <w:sz w:val="24"/>
                                 <w:szCs w:val="24"/>
                               </w:rPr>
-                              <w:t>{{committee</w:t>
-                            </w:r>
-                            <w:r>
-                              <w:rPr>
-                                <w:rFonts w:ascii="TH Sarabun New" w:hAnsi="TH Sarabun New" w:cs="TH Sarabun New"/>
-                                <w:sz w:val="24"/>
-                                <w:szCs w:val="24"/>
-                              </w:rPr>
-                              <w:t>3</w:t>
-                            </w:r>
-                            <w:r>
-                              <w:rPr>
-                                <w:rFonts w:ascii="TH Sarabun New" w:hAnsi="TH Sarabun New" w:cs="TH Sarabun New"/>
-                                <w:sz w:val="24"/>
-                                <w:szCs w:val="24"/>
-                              </w:rPr>
-                              <w:t>}}</w:t>
+                              <w:t>{{committee3}}</w:t>
                             </w:r>
                             <w:r>
                               <w:rPr>
@@ -4323,7 +3933,7 @@
                 <v:stroke joinstyle="miter"/>
                 <v:path gradientshapeok="t" o:connecttype="rect"/>
               </v:shapetype>
-              <v:shape id="กล่องข้อความ 2" o:spid="_x0000_s1026" type="#_x0000_t202" style="position:absolute;margin-left:265.45pt;margin-top:14.35pt;width:217.6pt;height:2in;z-index:251679744;visibility:visible;mso-wrap-style:square;mso-width-percent:0;mso-height-percent:0;mso-wrap-distance-left:9pt;mso-wrap-distance-top:3.6pt;mso-wrap-distance-right:9pt;mso-wrap-distance-bottom:3.6pt;mso-position-horizontal:absolute;mso-position-horizontal-relative:margin;mso-position-vertical:absolute;mso-position-vertical-relative:text;mso-width-percent:0;mso-height-percent:0;mso-width-relative:margin;mso-height-relative:margin;v-text-anchor:top" o:gfxdata="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" stroked="f">
+              <v:shape id="กล่องข้อความ 2" o:spid="_x0000_s1026" type="#_x0000_t202" style="position:absolute;margin-left:285.4pt;margin-top:5.1pt;width:217.6pt;height:2in;z-index:251679744;visibility:visible;mso-wrap-style:square;mso-width-percent:0;mso-height-percent:0;mso-wrap-distance-left:9pt;mso-wrap-distance-top:3.6pt;mso-wrap-distance-right:9pt;mso-wrap-distance-bottom:3.6pt;mso-position-horizontal:absolute;mso-position-horizontal-relative:margin;mso-position-vertical:absolute;mso-position-vertical-relative:text;mso-width-percent:0;mso-height-percent:0;mso-width-relative:margin;mso-height-relative:margin;v-text-anchor:top" o:gfxdata="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" stroked="f">
                 <v:textbox>
                   <w:txbxContent>
                     <w:p>
@@ -4439,23 +4049,7 @@
                           <w:sz w:val="24"/>
                           <w:szCs w:val="24"/>
                         </w:rPr>
-                        <w:t>{{committee</w:t>
-                      </w:r>
-                      <w:r>
-                        <w:rPr>
-                          <w:rFonts w:ascii="TH Sarabun New" w:hAnsi="TH Sarabun New" w:cs="TH Sarabun New"/>
-                          <w:sz w:val="24"/>
-                          <w:szCs w:val="24"/>
-                        </w:rPr>
-                        <w:t>2</w:t>
-                      </w:r>
-                      <w:r>
-                        <w:rPr>
-                          <w:rFonts w:ascii="TH Sarabun New" w:hAnsi="TH Sarabun New" w:cs="TH Sarabun New"/>
-                          <w:sz w:val="24"/>
-                          <w:szCs w:val="24"/>
-                        </w:rPr>
-                        <w:t>}}</w:t>
+                        <w:t>{{committee2}}</w:t>
                       </w:r>
                       <w:r>
                         <w:rPr>
@@ -4523,23 +4117,7 @@
                           <w:sz w:val="24"/>
                           <w:szCs w:val="24"/>
                         </w:rPr>
-                        <w:t>{{committee</w:t>
-                      </w:r>
-                      <w:r>
-                        <w:rPr>
-                          <w:rFonts w:ascii="TH Sarabun New" w:hAnsi="TH Sarabun New" w:cs="TH Sarabun New"/>
-                          <w:sz w:val="24"/>
-                          <w:szCs w:val="24"/>
-                        </w:rPr>
-                        <w:t>3</w:t>
-                      </w:r>
-                      <w:r>
-                        <w:rPr>
-                          <w:rFonts w:ascii="TH Sarabun New" w:hAnsi="TH Sarabun New" w:cs="TH Sarabun New"/>
-                          <w:sz w:val="24"/>
-                          <w:szCs w:val="24"/>
-                        </w:rPr>
-                        <w:t>}}</w:t>
+                        <w:t>{{committee3}}</w:t>
                       </w:r>
                       <w:r>
                         <w:rPr>
@@ -4562,6 +4140,75 @@
       <w:r>
         <w:rPr>
           <w:rFonts w:ascii="TH Sarabun New" w:hAnsi="TH Sarabun New" w:cs="TH Sarabun New"/>
+          <w:sz w:val="20"/>
+          <w:szCs w:val="20"/>
+          <w:cs/>
+        </w:rPr>
+        <w:t>๔. ความเป็นผู้มีคุณธรรมจริยธรรม และวิญญาณความเป็นครู</w:t>
+      </w:r>
+      <w:r>
+        <w:rPr>
+          <w:rFonts w:ascii="TH Sarabun New" w:hAnsi="TH Sarabun New" w:cs="TH Sarabun New"/>
+          <w:sz w:val="20"/>
+          <w:szCs w:val="20"/>
+        </w:rPr>
+        <w:tab/>
+      </w:r>
+      <w:r>
+        <w:rPr>
+          <w:rFonts w:ascii="TH Sarabun New" w:hAnsi="TH Sarabun New" w:cs="TH Sarabun New"/>
+          <w:sz w:val="20"/>
+          <w:szCs w:val="20"/>
+        </w:rPr>
+        <w:tab/>
+      </w:r>
+      <w:r>
+        <w:rPr>
+          <w:rFonts w:ascii="TH Sarabun New" w:hAnsi="TH Sarabun New" w:cs="TH Sarabun New"/>
+          <w:sz w:val="24"/>
+          <w:szCs w:val="24"/>
+        </w:rPr>
+        <w:t>{{score4x}}</w:t>
+      </w:r>
+      <w:r>
+        <w:rPr>
+          <w:rFonts w:ascii="TH Sarabun New" w:hAnsi="TH Sarabun New" w:cs="TH Sarabun New" w:hint="cs"/>
+          <w:sz w:val="20"/>
+          <w:szCs w:val="20"/>
+          <w:cs/>
+        </w:rPr>
+        <w:t xml:space="preserve"> </w:t>
+      </w:r>
+      <w:r>
+        <w:rPr>
+          <w:rFonts w:ascii="TH Sarabun New" w:hAnsi="TH Sarabun New" w:cs="TH Sarabun New"/>
+          <w:sz w:val="20"/>
+          <w:szCs w:val="20"/>
+          <w:cs/>
+        </w:rPr>
+        <w:t xml:space="preserve">คะแนน </w:t>
+      </w:r>
+      <w:r>
+        <w:rPr>
+          <w:rFonts w:ascii="TH Sarabun New" w:hAnsi="TH Sarabun New" w:cs="TH Sarabun New"/>
+          <w:sz w:val="20"/>
+          <w:szCs w:val="20"/>
+          <w:cs/>
+        </w:rPr>
+        <w:tab/>
+      </w:r>
+    </w:p>
+    <w:p>
+      <w:pPr>
+        <w:rPr>
+          <w:rFonts w:ascii="TH Sarabun New" w:hAnsi="TH Sarabun New" w:cs="TH Sarabun New"/>
+          <w:sz w:val="20"/>
+          <w:szCs w:val="20"/>
+        </w:rPr>
+      </w:pPr>
+      <w:r>
+        <w:rPr>
+          <w:rFonts w:ascii="TH Sarabun New" w:hAnsi="TH Sarabun New" w:cs="TH Sarabun New"/>
           <w:b/>
           <w:bCs/>
           <w:sz w:val="20"/>
@@ -4624,7 +4271,25 @@
           <w:sz w:val="24"/>
           <w:szCs w:val="24"/>
         </w:rPr>
-        <w:t>{{scorex}}</w:t>
+        <w:t>{{</w:t>
+      </w:r>
+      <w:proofErr w:type="spellStart"/>
+      <w:r>
+        <w:rPr>
+          <w:rFonts w:ascii="TH Sarabun New" w:hAnsi="TH Sarabun New" w:cs="TH Sarabun New"/>
+          <w:sz w:val="24"/>
+          <w:szCs w:val="24"/>
+        </w:rPr>
+        <w:t>scorex</w:t>
+      </w:r>
+      <w:proofErr w:type="spellEnd"/>
+      <w:r>
+        <w:rPr>
+          <w:rFonts w:ascii="TH Sarabun New" w:hAnsi="TH Sarabun New" w:cs="TH Sarabun New"/>
+          <w:sz w:val="24"/>
+          <w:szCs w:val="24"/>
+        </w:rPr>
+        <w:t>}}</w:t>
       </w:r>
       <w:r>
         <w:rPr>
@@ -4772,6 +4437,7 @@
     </w:p>
     <w:p>
       <w:pPr>
+        <w:spacing w:after="0" w:line="240" w:lineRule="auto"/>
         <w:rPr>
           <w:rFonts w:ascii="TH Sarabun New" w:hAnsi="TH Sarabun New" w:cs="TH Sarabun New"/>
           <w:sz w:val="20"/>
@@ -4790,7 +4456,7 @@
     </w:p>
     <w:p>
       <w:pPr>
-        <w:spacing w:after="0"/>
+        <w:spacing w:after="0" w:line="240" w:lineRule="auto"/>
         <w:rPr>
           <w:rFonts w:ascii="TH Sarabun New" w:hAnsi="TH Sarabun New" w:cs="TH Sarabun New"/>
           <w:szCs w:val="22"/>
@@ -4802,12 +4468,12 @@
           <w:szCs w:val="22"/>
           <w:cs/>
         </w:rPr>
-        <w:t>ผู้ช่วยศาสตราจารย์ ต้องมีผลการประเมินไม่ต่ำกว่าระดับชำนาญ</w:t>
+        <w:t xml:space="preserve">ผู้ช่วยศาสตราจารย์ ต้องมีผลการประเมินไม่ต่ำกว่าระดับชำนาญรองศาสตราจารย์ </w:t>
       </w:r>
     </w:p>
     <w:p>
       <w:pPr>
-        <w:spacing w:after="0"/>
+        <w:spacing w:after="0" w:line="240" w:lineRule="auto"/>
         <w:rPr>
           <w:rFonts w:ascii="TH Sarabun New" w:hAnsi="TH Sarabun New" w:cs="TH Sarabun New"/>
           <w:szCs w:val="22"/>
@@ -4819,7 +4485,7 @@
           <w:szCs w:val="22"/>
           <w:cs/>
         </w:rPr>
-        <w:t>รองศาสตราจารย์ ต้องมีผลการประเมินไม่ต่ำกว่าระดับชำนาญพิเศษ</w:t>
+        <w:t>ต้องมีผลการประเมินไม่ต่ำกว่าระดับชำนาญพิเศษ</w:t>
       </w:r>
     </w:p>
     <w:sectPr>
@@ -4905,7 +4571,7 @@
     <w:sdtContent>
       <w:p>
         <w:pPr>
-          <w:pStyle w:val="a4"/>
+          <w:pStyle w:val="Header"/>
           <w:jc w:val="center"/>
           <w:rPr>
             <w:rFonts w:ascii="TH Sarabun New" w:hAnsi="TH Sarabun New" w:cs="TH Sarabun New"/>
@@ -5728,17 +5394,17 @@
     <w:lsdException w:name="Unresolved Mention" w:semiHidden="1" w:unhideWhenUsed="1"/>
     <w:lsdException w:name="Smart Link" w:semiHidden="1" w:unhideWhenUsed="1"/>
   </w:latentStyles>
-  <w:style w:type="paragraph" w:default="1" w:styleId="a">
+  <w:style w:type="paragraph" w:default="1" w:styleId="Normal">
     <w:name w:val="Normal"/>
     <w:qFormat/>
     <w:rsid w:val="008C0D0C"/>
   </w:style>
-  <w:style w:type="character" w:default="1" w:styleId="a0">
+  <w:style w:type="character" w:default="1" w:styleId="DefaultParagraphFont">
     <w:name w:val="Default Paragraph Font"/>
     <w:uiPriority w:val="1"/>
     <w:unhideWhenUsed/>
   </w:style>
-  <w:style w:type="table" w:default="1" w:styleId="a1">
+  <w:style w:type="table" w:default="1" w:styleId="TableNormal">
     <w:name w:val="Normal Table"/>
     <w:uiPriority w:val="99"/>
     <w:semiHidden/>
@@ -5753,15 +5419,15 @@
       </w:tblCellMar>
     </w:tblPr>
   </w:style>
-  <w:style w:type="numbering" w:default="1" w:styleId="a2">
+  <w:style w:type="numbering" w:default="1" w:styleId="NoList">
     <w:name w:val="No List"/>
     <w:uiPriority w:val="99"/>
     <w:semiHidden/>
     <w:unhideWhenUsed/>
   </w:style>
-  <w:style w:type="paragraph" w:styleId="a3">
+  <w:style w:type="paragraph" w:styleId="ListParagraph">
     <w:name w:val="List Paragraph"/>
-    <w:basedOn w:val="a"/>
+    <w:basedOn w:val="Normal"/>
     <w:uiPriority w:val="34"/>
     <w:qFormat/>
     <w:rsid w:val="008C0D0C"/>
@@ -5770,10 +5436,10 @@
       <w:contextualSpacing/>
     </w:pPr>
   </w:style>
-  <w:style w:type="paragraph" w:styleId="a4">
+  <w:style w:type="paragraph" w:styleId="Header">
     <w:name w:val="header"/>
-    <w:basedOn w:val="a"/>
-    <w:link w:val="a5"/>
+    <w:basedOn w:val="Normal"/>
+    <w:link w:val="HeaderChar"/>
     <w:uiPriority w:val="99"/>
     <w:unhideWhenUsed/>
     <w:rsid w:val="00BE4789"/>
@@ -5785,17 +5451,17 @@
       <w:spacing w:after="0" w:line="240" w:lineRule="auto"/>
     </w:pPr>
   </w:style>
-  <w:style w:type="character" w:customStyle="1" w:styleId="a5">
-    <w:name w:val="หัวกระดาษ อักขระ"/>
-    <w:basedOn w:val="a0"/>
-    <w:link w:val="a4"/>
+  <w:style w:type="character" w:customStyle="1" w:styleId="HeaderChar">
+    <w:name w:val="Header Char"/>
+    <w:basedOn w:val="DefaultParagraphFont"/>
+    <w:link w:val="Header"/>
     <w:uiPriority w:val="99"/>
     <w:rsid w:val="00BE4789"/>
   </w:style>
-  <w:style w:type="paragraph" w:styleId="a6">
+  <w:style w:type="paragraph" w:styleId="Footer">
     <w:name w:val="footer"/>
-    <w:basedOn w:val="a"/>
-    <w:link w:val="a7"/>
+    <w:basedOn w:val="Normal"/>
+    <w:link w:val="FooterChar"/>
     <w:uiPriority w:val="99"/>
     <w:unhideWhenUsed/>
     <w:rsid w:val="00BE4789"/>
@@ -5807,10 +5473,10 @@
       <w:spacing w:after="0" w:line="240" w:lineRule="auto"/>
     </w:pPr>
   </w:style>
-  <w:style w:type="character" w:customStyle="1" w:styleId="a7">
-    <w:name w:val="ท้ายกระดาษ อักขระ"/>
-    <w:basedOn w:val="a0"/>
-    <w:link w:val="a6"/>
+  <w:style w:type="character" w:customStyle="1" w:styleId="FooterChar">
+    <w:name w:val="Footer Char"/>
+    <w:basedOn w:val="DefaultParagraphFont"/>
+    <w:link w:val="Footer"/>
     <w:uiPriority w:val="99"/>
     <w:rsid w:val="00BE4789"/>
   </w:style>

</xml_diff>

<commit_message>
Revamp DOCX processing and update deps
Major refactor: replace POI-based in-place DOCX editing with a pure ZIP/XML template processor and LibreOffice CLI PDF conversion. DocumentGenerationService now defragments split {{placeholders}}, performs XML-safe replacements, renders checkbox glyphs as MS Gothic runs, and converts DOCX→PDF via soffice for higher fidelity. Added safer preview/generation paths, improved temp file handling and utilities.

Pom.xml reorganized and updated: added/updated starters and libraries (security, mail, jodconverter, poi-ooxml, poi-tl, zip4j, aws-java-sdk-s3, jackson, zxing, mysql, h2 for tests, etc.) and cleaned dependency layout. Controller cleanup/fixes: consistent TypeReference usage, minor formatting/whitespace fixes, changed checkbox glyph to a font-aware variant, improved filename/type checks, and toThaiDigits null/empty handling. Application properties annotated with LibreOffice note. Updated/added DOCX template and uploaded sample files.
</commit_message>
<xml_diff>
--- a/shopping-cart-spring-boot-main/src/main/resources/templates/docx/doc_6.docx
+++ b/shopping-cart-spring-boot-main/src/main/resources/templates/docx/doc_6.docx
@@ -1887,7 +1887,47 @@
                 <w:szCs w:val="20"/>
                 <w:cs/>
               </w:rPr>
-              <w:t xml:space="preserve"> เช่น มคอ. ๓ มคอ.๕</w:t>
+              <w:t xml:space="preserve"> เช่น </w:t>
+            </w:r>
+            <w:proofErr w:type="spellStart"/>
+            <w:r>
+              <w:rPr>
+                <w:rFonts w:ascii="TH Sarabun New" w:hAnsi="TH Sarabun New" w:cs="TH Sarabun New"/>
+                <w:sz w:val="20"/>
+                <w:szCs w:val="20"/>
+                <w:cs/>
+              </w:rPr>
+              <w:t>มคอ</w:t>
+            </w:r>
+            <w:proofErr w:type="spellEnd"/>
+            <w:r>
+              <w:rPr>
+                <w:rFonts w:ascii="TH Sarabun New" w:hAnsi="TH Sarabun New" w:cs="TH Sarabun New"/>
+                <w:sz w:val="20"/>
+                <w:szCs w:val="20"/>
+                <w:cs/>
+              </w:rPr>
+              <w:t xml:space="preserve">. ๓ </w:t>
+            </w:r>
+            <w:proofErr w:type="spellStart"/>
+            <w:r>
+              <w:rPr>
+                <w:rFonts w:ascii="TH Sarabun New" w:hAnsi="TH Sarabun New" w:cs="TH Sarabun New"/>
+                <w:sz w:val="20"/>
+                <w:szCs w:val="20"/>
+                <w:cs/>
+              </w:rPr>
+              <w:t>มคอ</w:t>
+            </w:r>
+            <w:proofErr w:type="spellEnd"/>
+            <w:r>
+              <w:rPr>
+                <w:rFonts w:ascii="TH Sarabun New" w:hAnsi="TH Sarabun New" w:cs="TH Sarabun New"/>
+                <w:sz w:val="20"/>
+                <w:szCs w:val="20"/>
+                <w:cs/>
+              </w:rPr>
+              <w:t>.๕</w:t>
             </w:r>
             <w:r>
               <w:rPr>
@@ -3254,25 +3294,7 @@
                 <w:sz w:val="24"/>
                 <w:szCs w:val="24"/>
               </w:rPr>
-              <w:t>{{</w:t>
-            </w:r>
-            <w:proofErr w:type="spellStart"/>
-            <w:r>
-              <w:rPr>
-                <w:rFonts w:ascii="TH Sarabun New" w:hAnsi="TH Sarabun New" w:cs="TH Sarabun New"/>
-                <w:sz w:val="24"/>
-                <w:szCs w:val="24"/>
-              </w:rPr>
-              <w:t>scorex</w:t>
-            </w:r>
-            <w:proofErr w:type="spellEnd"/>
-            <w:r>
-              <w:rPr>
-                <w:rFonts w:ascii="TH Sarabun New" w:hAnsi="TH Sarabun New" w:cs="TH Sarabun New"/>
-                <w:sz w:val="24"/>
-                <w:szCs w:val="24"/>
-              </w:rPr>
-              <w:t>}}</w:t>
+              <w:t>{{scorex}}</w:t>
             </w:r>
           </w:p>
         </w:tc>
@@ -3408,113 +3430,64 @@
         </w:rPr>
         <w:t xml:space="preserve"> ไม่ผ่าน</w:t>
       </w:r>
-      <w:proofErr w:type="gramStart"/>
-      <w:r>
-        <w:rPr>
-          <w:rFonts w:ascii="TH Sarabun New" w:hAnsi="TH Sarabun New" w:cs="TH Sarabun New"/>
-          <w:sz w:val="20"/>
-          <w:szCs w:val="20"/>
-          <w:cs/>
-        </w:rPr>
-        <w:t xml:space="preserve">   </w:t>
-      </w:r>
-      <w:r>
-        <w:rPr>
-          <w:rFonts w:ascii="TH Sarabun New" w:hAnsi="TH Sarabun New" w:cs="TH Sarabun New"/>
-          <w:sz w:val="20"/>
-          <w:szCs w:val="20"/>
-        </w:rPr>
-        <w:t>{</w:t>
-      </w:r>
-      <w:proofErr w:type="gramEnd"/>
-      <w:r>
-        <w:rPr>
-          <w:rFonts w:ascii="TH Sarabun New" w:hAnsi="TH Sarabun New" w:cs="TH Sarabun New"/>
-          <w:sz w:val="20"/>
-          <w:szCs w:val="20"/>
-        </w:rPr>
-        <w:t>{ch2}}</w:t>
-      </w:r>
-      <w:r>
-        <w:rPr>
-          <w:rFonts w:ascii="TH Sarabun New" w:hAnsi="TH Sarabun New" w:cs="TH Sarabun New"/>
-          <w:sz w:val="20"/>
-          <w:szCs w:val="20"/>
-          <w:cs/>
+      <w:r>
+        <w:rPr>
+          <w:rFonts w:ascii="TH Sarabun New" w:hAnsi="TH Sarabun New" w:cs="TH Sarabun New"/>
+          <w:sz w:val="20"/>
+          <w:szCs w:val="20"/>
         </w:rPr>
         <w:t xml:space="preserve"> </w:t>
       </w:r>
-      <w:proofErr w:type="gramStart"/>
-      <w:r>
-        <w:rPr>
-          <w:rFonts w:ascii="TH Sarabun New" w:hAnsi="TH Sarabun New" w:cs="TH Sarabun New"/>
-          <w:sz w:val="20"/>
-          <w:szCs w:val="20"/>
-          <w:cs/>
-        </w:rPr>
-        <w:t xml:space="preserve">ชำนาญ  </w:t>
-      </w:r>
-      <w:r>
-        <w:rPr>
-          <w:rFonts w:ascii="TH Sarabun New" w:hAnsi="TH Sarabun New" w:cs="TH Sarabun New"/>
-          <w:sz w:val="20"/>
-          <w:szCs w:val="20"/>
-        </w:rPr>
-        <w:t>{</w:t>
-      </w:r>
-      <w:proofErr w:type="gramEnd"/>
-      <w:r>
-        <w:rPr>
-          <w:rFonts w:ascii="TH Sarabun New" w:hAnsi="TH Sarabun New" w:cs="TH Sarabun New"/>
-          <w:sz w:val="20"/>
-          <w:szCs w:val="20"/>
-        </w:rPr>
-        <w:t>{ch3}}</w:t>
-      </w:r>
-      <w:r>
-        <w:rPr>
-          <w:rFonts w:ascii="TH Sarabun New" w:hAnsi="TH Sarabun New" w:cs="TH Sarabun New"/>
-          <w:sz w:val="20"/>
-          <w:szCs w:val="20"/>
-          <w:cs/>
-        </w:rPr>
-        <w:t xml:space="preserve"> ชำนาญพิเศษ</w:t>
-      </w:r>
-      <w:proofErr w:type="gramStart"/>
-      <w:r>
-        <w:rPr>
-          <w:rFonts w:ascii="TH Sarabun New" w:hAnsi="TH Sarabun New" w:cs="TH Sarabun New"/>
-          <w:sz w:val="20"/>
-          <w:szCs w:val="20"/>
-          <w:cs/>
-        </w:rPr>
-        <w:t xml:space="preserve">   </w:t>
-      </w:r>
-      <w:r>
-        <w:rPr>
-          <w:rFonts w:ascii="TH Sarabun New" w:hAnsi="TH Sarabun New" w:cs="TH Sarabun New"/>
-          <w:sz w:val="20"/>
-          <w:szCs w:val="20"/>
-        </w:rPr>
-        <w:t>{</w:t>
-      </w:r>
-      <w:proofErr w:type="gramEnd"/>
-      <w:r>
-        <w:rPr>
-          <w:rFonts w:ascii="TH Sarabun New" w:hAnsi="TH Sarabun New" w:cs="TH Sarabun New"/>
-          <w:sz w:val="20"/>
-          <w:szCs w:val="20"/>
-        </w:rPr>
-        <w:t>{ch4</w:t>
-      </w:r>
-      <w:proofErr w:type="gramStart"/>
-      <w:r>
-        <w:rPr>
-          <w:rFonts w:ascii="TH Sarabun New" w:hAnsi="TH Sarabun New" w:cs="TH Sarabun New"/>
-          <w:sz w:val="20"/>
-          <w:szCs w:val="20"/>
-        </w:rPr>
-        <w:t>}}</w:t>
+      <w:r>
+        <w:rPr>
+          <w:rFonts w:ascii="TH Sarabun New" w:hAnsi="TH Sarabun New" w:cs="TH Sarabun New"/>
+          <w:sz w:val="20"/>
+          <w:szCs w:val="20"/>
+          <w:cs/>
+        </w:rPr>
+        <w:t xml:space="preserve"> </w:t>
+      </w:r>
+      <w:r>
+        <w:rPr>
+          <w:rFonts w:ascii="TH Sarabun New" w:hAnsi="TH Sarabun New" w:cs="TH Sarabun New"/>
+          <w:sz w:val="20"/>
+          <w:szCs w:val="20"/>
+        </w:rPr>
+        <w:t>{{ch2}}</w:t>
+      </w:r>
+      <w:r>
+        <w:rPr>
+          <w:rFonts w:ascii="TH Sarabun New" w:hAnsi="TH Sarabun New" w:cs="TH Sarabun New"/>
+          <w:sz w:val="20"/>
+          <w:szCs w:val="20"/>
+          <w:cs/>
+        </w:rPr>
+        <w:t xml:space="preserve"> ชำนาญ  </w:t>
+      </w:r>
+      <w:r>
+        <w:rPr>
+          <w:rFonts w:ascii="TH Sarabun New" w:hAnsi="TH Sarabun New" w:cs="TH Sarabun New"/>
+          <w:sz w:val="20"/>
+          <w:szCs w:val="20"/>
+        </w:rPr>
+        <w:t>{{ch3}}</w:t>
+      </w:r>
+      <w:r>
+        <w:rPr>
+          <w:rFonts w:ascii="TH Sarabun New" w:hAnsi="TH Sarabun New" w:cs="TH Sarabun New"/>
+          <w:sz w:val="20"/>
+          <w:szCs w:val="20"/>
+          <w:cs/>
+        </w:rPr>
+        <w:t xml:space="preserve"> ชำนาญพิเศษ </w:t>
+      </w:r>
+      <w:r>
+        <w:rPr>
+          <w:rFonts w:ascii="TH Sarabun New" w:hAnsi="TH Sarabun New" w:cs="TH Sarabun New"/>
+          <w:sz w:val="20"/>
+          <w:szCs w:val="20"/>
+        </w:rPr>
+        <w:t>{{ch4}}</w:t>
       </w:r>
       <w:r>
         <w:rPr>
@@ -3525,7 +3498,6 @@
         </w:rPr>
         <w:t>เชี่ยวชาญ</w:t>
       </w:r>
-      <w:proofErr w:type="gramEnd"/>
     </w:p>
     <w:p>
       <w:pPr>
@@ -3557,16 +3529,16 @@
       <w:r>
         <w:rPr>
           <w:rFonts w:ascii="TH Sarabun New" w:hAnsi="TH Sarabun New" w:cs="TH Sarabun New"/>
-          <w:sz w:val="24"/>
-          <w:szCs w:val="24"/>
+          <w:sz w:val="20"/>
+          <w:szCs w:val="20"/>
         </w:rPr>
         <w:t>{{score1x}}</w:t>
       </w:r>
       <w:r>
         <w:rPr>
           <w:rFonts w:ascii="TH Sarabun New" w:hAnsi="TH Sarabun New" w:cs="TH Sarabun New"/>
-          <w:sz w:val="24"/>
-          <w:szCs w:val="24"/>
+          <w:sz w:val="20"/>
+          <w:szCs w:val="20"/>
         </w:rPr>
         <w:t xml:space="preserve"> </w:t>
       </w:r>
@@ -3644,16 +3616,16 @@
       <w:r>
         <w:rPr>
           <w:rFonts w:ascii="TH Sarabun New" w:hAnsi="TH Sarabun New" w:cs="TH Sarabun New"/>
-          <w:sz w:val="24"/>
-          <w:szCs w:val="24"/>
+          <w:sz w:val="20"/>
+          <w:szCs w:val="20"/>
         </w:rPr>
         <w:t>{{score2x}}</w:t>
       </w:r>
       <w:r>
         <w:rPr>
           <w:rFonts w:ascii="TH Sarabun New" w:hAnsi="TH Sarabun New" w:cs="TH Sarabun New"/>
-          <w:sz w:val="20"/>
-          <w:szCs w:val="20"/>
+          <w:sz w:val="15"/>
+          <w:szCs w:val="15"/>
         </w:rPr>
         <w:t xml:space="preserve"> </w:t>
       </w:r>
@@ -3674,88 +3646,6 @@
           <w:rFonts w:ascii="TH Sarabun New" w:hAnsi="TH Sarabun New" w:cs="TH Sarabun New"/>
           <w:sz w:val="20"/>
           <w:szCs w:val="20"/>
-        </w:rPr>
-      </w:pPr>
-      <w:r>
-        <w:rPr>
-          <w:rFonts w:ascii="TH Sarabun New" w:hAnsi="TH Sarabun New" w:cs="TH Sarabun New"/>
-          <w:sz w:val="20"/>
-          <w:szCs w:val="20"/>
-          <w:cs/>
-        </w:rPr>
-        <w:t>๓. ความสามารถด้านการจัดการเรียนการสอน</w:t>
-      </w:r>
-      <w:r>
-        <w:rPr>
-          <w:rFonts w:ascii="TH Sarabun New" w:hAnsi="TH Sarabun New" w:cs="TH Sarabun New"/>
-          <w:sz w:val="20"/>
-          <w:szCs w:val="20"/>
-          <w:cs/>
-        </w:rPr>
-        <w:tab/>
-      </w:r>
-      <w:r>
-        <w:rPr>
-          <w:rFonts w:ascii="TH Sarabun New" w:hAnsi="TH Sarabun New" w:cs="TH Sarabun New"/>
-          <w:sz w:val="20"/>
-          <w:szCs w:val="20"/>
-          <w:cs/>
-        </w:rPr>
-        <w:tab/>
-      </w:r>
-      <w:r>
-        <w:rPr>
-          <w:rFonts w:ascii="TH Sarabun New" w:hAnsi="TH Sarabun New" w:cs="TH Sarabun New"/>
-          <w:sz w:val="20"/>
-          <w:szCs w:val="20"/>
-          <w:cs/>
-        </w:rPr>
-        <w:tab/>
-      </w:r>
-      <w:r>
-        <w:rPr>
-          <w:rFonts w:ascii="TH Sarabun New" w:hAnsi="TH Sarabun New" w:cs="TH Sarabun New"/>
-          <w:sz w:val="20"/>
-          <w:szCs w:val="20"/>
-          <w:cs/>
-        </w:rPr>
-        <w:tab/>
-      </w:r>
-      <w:r>
-        <w:rPr>
-          <w:rFonts w:ascii="TH Sarabun New" w:hAnsi="TH Sarabun New" w:cs="TH Sarabun New"/>
-          <w:sz w:val="24"/>
-          <w:szCs w:val="24"/>
-        </w:rPr>
-        <w:t>{{score3x}}</w:t>
-      </w:r>
-      <w:r>
-        <w:rPr>
-          <w:rFonts w:ascii="TH Sarabun New" w:hAnsi="TH Sarabun New" w:cs="TH Sarabun New" w:hint="cs"/>
-          <w:sz w:val="20"/>
-          <w:szCs w:val="20"/>
-          <w:cs/>
-        </w:rPr>
-        <w:t xml:space="preserve"> </w:t>
-      </w:r>
-      <w:r>
-        <w:rPr>
-          <w:rFonts w:ascii="TH Sarabun New" w:hAnsi="TH Sarabun New" w:cs="TH Sarabun New"/>
-          <w:sz w:val="20"/>
-          <w:szCs w:val="20"/>
-          <w:cs/>
-        </w:rPr>
-        <w:t>คะแนน</w:t>
-      </w:r>
-    </w:p>
-    <w:p>
-      <w:pPr>
-        <w:spacing w:after="0"/>
-        <w:rPr>
-          <w:rFonts w:ascii="TH Sarabun New" w:hAnsi="TH Sarabun New" w:cs="TH Sarabun New"/>
-          <w:sz w:val="20"/>
-          <w:szCs w:val="20"/>
-          <w:cs/>
         </w:rPr>
       </w:pPr>
       <w:r>
@@ -3769,31 +3659,31 @@
         <mc:AlternateContent>
           <mc:Choice Requires="wps">
             <w:drawing>
-              <wp:anchor distT="45720" distB="45720" distL="114300" distR="114300" simplePos="0" relativeHeight="251679744" behindDoc="0" locked="0" layoutInCell="1" allowOverlap="1" wp14:anchorId="4A59BA1E" wp14:editId="5A7E5F41">
+              <wp:anchor distT="45720" distB="45720" distL="114300" distR="114300" simplePos="0" relativeHeight="251679744" behindDoc="0" locked="1" layoutInCell="1" allowOverlap="1" wp14:anchorId="4A59BA1E" wp14:editId="754B840A">
                 <wp:simplePos x="0" y="0"/>
                 <wp:positionH relativeFrom="margin">
-                  <wp:posOffset>3624580</wp:posOffset>
+                  <wp:posOffset>3715385</wp:posOffset>
                 </wp:positionH>
-                <wp:positionV relativeFrom="paragraph">
-                  <wp:posOffset>64770</wp:posOffset>
+                <wp:positionV relativeFrom="page">
+                  <wp:posOffset>7809230</wp:posOffset>
                 </wp:positionV>
-                <wp:extent cx="2763672" cy="1828800"/>
-                <wp:effectExtent l="0" t="0" r="0" b="0"/>
-                <wp:wrapNone/>
+                <wp:extent cx="2764800" cy="2160000"/>
+                <wp:effectExtent l="0" t="0" r="3810" b="0"/>
+                <wp:wrapSquare wrapText="bothSides"/>
                 <wp:docPr id="217" name="กล่องข้อความ 2"/>
                 <wp:cNvGraphicFramePr>
-                  <a:graphicFrameLocks xmlns:a="http://schemas.openxmlformats.org/drawingml/2006/main"/>
+                  <a:graphicFrameLocks xmlns:a="http://schemas.openxmlformats.org/drawingml/2006/main" noChangeAspect="1"/>
                 </wp:cNvGraphicFramePr>
                 <a:graphic xmlns:a="http://schemas.openxmlformats.org/drawingml/2006/main">
                   <a:graphicData uri="http://schemas.microsoft.com/office/word/2010/wordprocessingShape">
                     <wps:wsp>
                       <wps:cNvSpPr txBox="1">
-                        <a:spLocks noChangeArrowheads="1"/>
+                        <a:spLocks noChangeAspect="1" noChangeArrowheads="1"/>
                       </wps:cNvSpPr>
                       <wps:spPr bwMode="auto">
                         <a:xfrm>
                           <a:off x="0" y="0"/>
-                          <a:ext cx="2763672" cy="1828800"/>
+                          <a:ext cx="2764800" cy="2160000"/>
                         </a:xfrm>
                         <a:prstGeom prst="rect">
                           <a:avLst/>
@@ -3827,7 +3717,24 @@
                                 <w:szCs w:val="24"/>
                                 <w:cs/>
                               </w:rPr>
-                              <w:t>ลงชื่อ.....................................................ประธานคณะกรรมการ</w:t>
+                              <w:t>ลงชื่อ</w:t>
+                            </w:r>
+                            <w:r>
+                              <w:rPr>
+                                <w:rFonts w:ascii="TH Sarabun New" w:hAnsi="TH Sarabun New" w:cs="TH Sarabun New"/>
+                                <w:sz w:val="24"/>
+                                <w:szCs w:val="24"/>
+                              </w:rPr>
+                              <w:t>……………………………………………..</w:t>
+                            </w:r>
+                            <w:r>
+                              <w:rPr>
+                                <w:rFonts w:ascii="TH Sarabun New" w:hAnsi="TH Sarabun New" w:cs="TH Sarabun New"/>
+                                <w:sz w:val="24"/>
+                                <w:szCs w:val="24"/>
+                                <w:cs/>
+                              </w:rPr>
+                              <w:t>ประธานคณะกรรมการ</w:t>
                             </w:r>
                           </w:p>
                           <w:p>
@@ -3888,6 +3795,17 @@
                                 <w:szCs w:val="24"/>
                               </w:rPr>
                             </w:pPr>
+                          </w:p>
+                          <w:p>
+                            <w:pPr>
+                              <w:spacing w:after="0" w:line="240" w:lineRule="auto"/>
+                              <w:jc w:val="center"/>
+                              <w:rPr>
+                                <w:rFonts w:ascii="TH Sarabun New" w:hAnsi="TH Sarabun New" w:cs="TH Sarabun New"/>
+                                <w:sz w:val="24"/>
+                                <w:szCs w:val="24"/>
+                              </w:rPr>
+                            </w:pPr>
                             <w:r>
                               <w:rPr>
                                 <w:rFonts w:ascii="TH Sarabun New" w:hAnsi="TH Sarabun New" w:cs="TH Sarabun New"/>
@@ -3895,7 +3813,24 @@
                                 <w:szCs w:val="24"/>
                                 <w:cs/>
                               </w:rPr>
-                              <w:t>ชื่อ...............................................กรรมการ</w:t>
+                              <w:t>ชื่อ</w:t>
+                            </w:r>
+                            <w:r>
+                              <w:rPr>
+                                <w:rFonts w:ascii="TH Sarabun New" w:hAnsi="TH Sarabun New" w:cs="TH Sarabun New"/>
+                                <w:sz w:val="24"/>
+                                <w:szCs w:val="24"/>
+                              </w:rPr>
+                              <w:t>……………………………………………</w:t>
+                            </w:r>
+                            <w:r>
+                              <w:rPr>
+                                <w:rFonts w:ascii="TH Sarabun New" w:hAnsi="TH Sarabun New" w:cs="TH Sarabun New"/>
+                                <w:sz w:val="24"/>
+                                <w:szCs w:val="24"/>
+                                <w:cs/>
+                              </w:rPr>
+                              <w:t>กรรมการ</w:t>
                             </w:r>
                           </w:p>
                           <w:p>
@@ -3956,6 +3891,17 @@
                                 <w:szCs w:val="24"/>
                               </w:rPr>
                             </w:pPr>
+                          </w:p>
+                          <w:p>
+                            <w:pPr>
+                              <w:spacing w:after="0" w:line="240" w:lineRule="auto"/>
+                              <w:jc w:val="center"/>
+                              <w:rPr>
+                                <w:rFonts w:ascii="TH Sarabun New" w:hAnsi="TH Sarabun New" w:cs="TH Sarabun New"/>
+                                <w:sz w:val="24"/>
+                                <w:szCs w:val="24"/>
+                              </w:rPr>
+                            </w:pPr>
                             <w:r>
                               <w:rPr>
                                 <w:rFonts w:ascii="TH Sarabun New" w:hAnsi="TH Sarabun New" w:cs="TH Sarabun New"/>
@@ -3963,7 +3909,24 @@
                                 <w:szCs w:val="24"/>
                                 <w:cs/>
                               </w:rPr>
-                              <w:t>ชื่อ...............................................กรรมการ</w:t>
+                              <w:t>ชื่อ</w:t>
+                            </w:r>
+                            <w:r>
+                              <w:rPr>
+                                <w:rFonts w:ascii="TH Sarabun New" w:hAnsi="TH Sarabun New" w:cs="TH Sarabun New"/>
+                                <w:sz w:val="24"/>
+                                <w:szCs w:val="24"/>
+                              </w:rPr>
+                              <w:t>………………………………………….</w:t>
+                            </w:r>
+                            <w:r>
+                              <w:rPr>
+                                <w:rFonts w:ascii="TH Sarabun New" w:hAnsi="TH Sarabun New" w:cs="TH Sarabun New"/>
+                                <w:sz w:val="24"/>
+                                <w:szCs w:val="24"/>
+                                <w:cs/>
+                              </w:rPr>
+                              <w:t>กรรมการ</w:t>
                             </w:r>
                           </w:p>
                           <w:p>
@@ -4026,7 +3989,8 @@
                 <v:stroke joinstyle="miter"/>
                 <v:path gradientshapeok="t" o:connecttype="rect"/>
               </v:shapetype>
-              <v:shape id="กล่องข้อความ 2" o:spid="_x0000_s1026" type="#_x0000_t202" style="position:absolute;margin-left:285.4pt;margin-top:5.1pt;width:217.6pt;height:2in;z-index:251679744;visibility:visible;mso-wrap-style:square;mso-width-percent:0;mso-height-percent:0;mso-wrap-distance-left:9pt;mso-wrap-distance-top:3.6pt;mso-wrap-distance-right:9pt;mso-wrap-distance-bottom:3.6pt;mso-position-horizontal:absolute;mso-position-horizontal-relative:margin;mso-position-vertical:absolute;mso-position-vertical-relative:text;mso-width-percent:0;mso-height-percent:0;mso-width-relative:margin;mso-height-relative:margin;v-text-anchor:top" o:gfxdata="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" stroked="f">
+              <v:shape id="กล่องข้อความ 2" o:spid="_x0000_s1026" type="#_x0000_t202" style="position:absolute;margin-left:292.55pt;margin-top:614.9pt;width:217.7pt;height:170.1pt;z-index:251679744;visibility:visible;mso-wrap-style:square;mso-width-percent:0;mso-height-percent:0;mso-wrap-distance-left:9pt;mso-wrap-distance-top:3.6pt;mso-wrap-distance-right:9pt;mso-wrap-distance-bottom:3.6pt;mso-position-horizontal:absolute;mso-position-horizontal-relative:margin;mso-position-vertical:absolute;mso-position-vertical-relative:page;mso-width-percent:0;mso-height-percent:0;mso-width-relative:margin;mso-height-relative:margin;v-text-anchor:top" o:gfxdata="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" stroked="f">
+                <o:lock v:ext="edit" aspectratio="t"/>
                 <v:textbox>
                   <w:txbxContent>
                     <w:p>
@@ -4046,7 +4010,24 @@
                           <w:szCs w:val="24"/>
                           <w:cs/>
                         </w:rPr>
-                        <w:t>ลงชื่อ.....................................................ประธานคณะกรรมการ</w:t>
+                        <w:t>ลงชื่อ</w:t>
+                      </w:r>
+                      <w:r>
+                        <w:rPr>
+                          <w:rFonts w:ascii="TH Sarabun New" w:hAnsi="TH Sarabun New" w:cs="TH Sarabun New"/>
+                          <w:sz w:val="24"/>
+                          <w:szCs w:val="24"/>
+                        </w:rPr>
+                        <w:t>……………………………………………..</w:t>
+                      </w:r>
+                      <w:r>
+                        <w:rPr>
+                          <w:rFonts w:ascii="TH Sarabun New" w:hAnsi="TH Sarabun New" w:cs="TH Sarabun New"/>
+                          <w:sz w:val="24"/>
+                          <w:szCs w:val="24"/>
+                          <w:cs/>
+                        </w:rPr>
+                        <w:t>ประธานคณะกรรมการ</w:t>
                       </w:r>
                     </w:p>
                     <w:p>
@@ -4107,6 +4088,17 @@
                           <w:szCs w:val="24"/>
                         </w:rPr>
                       </w:pPr>
+                    </w:p>
+                    <w:p>
+                      <w:pPr>
+                        <w:spacing w:after="0" w:line="240" w:lineRule="auto"/>
+                        <w:jc w:val="center"/>
+                        <w:rPr>
+                          <w:rFonts w:ascii="TH Sarabun New" w:hAnsi="TH Sarabun New" w:cs="TH Sarabun New"/>
+                          <w:sz w:val="24"/>
+                          <w:szCs w:val="24"/>
+                        </w:rPr>
+                      </w:pPr>
                       <w:r>
                         <w:rPr>
                           <w:rFonts w:ascii="TH Sarabun New" w:hAnsi="TH Sarabun New" w:cs="TH Sarabun New"/>
@@ -4114,7 +4106,24 @@
                           <w:szCs w:val="24"/>
                           <w:cs/>
                         </w:rPr>
-                        <w:t>ชื่อ...............................................กรรมการ</w:t>
+                        <w:t>ชื่อ</w:t>
+                      </w:r>
+                      <w:r>
+                        <w:rPr>
+                          <w:rFonts w:ascii="TH Sarabun New" w:hAnsi="TH Sarabun New" w:cs="TH Sarabun New"/>
+                          <w:sz w:val="24"/>
+                          <w:szCs w:val="24"/>
+                        </w:rPr>
+                        <w:t>……………………………………………</w:t>
+                      </w:r>
+                      <w:r>
+                        <w:rPr>
+                          <w:rFonts w:ascii="TH Sarabun New" w:hAnsi="TH Sarabun New" w:cs="TH Sarabun New"/>
+                          <w:sz w:val="24"/>
+                          <w:szCs w:val="24"/>
+                          <w:cs/>
+                        </w:rPr>
+                        <w:t>กรรมการ</w:t>
                       </w:r>
                     </w:p>
                     <w:p>
@@ -4175,6 +4184,17 @@
                           <w:szCs w:val="24"/>
                         </w:rPr>
                       </w:pPr>
+                    </w:p>
+                    <w:p>
+                      <w:pPr>
+                        <w:spacing w:after="0" w:line="240" w:lineRule="auto"/>
+                        <w:jc w:val="center"/>
+                        <w:rPr>
+                          <w:rFonts w:ascii="TH Sarabun New" w:hAnsi="TH Sarabun New" w:cs="TH Sarabun New"/>
+                          <w:sz w:val="24"/>
+                          <w:szCs w:val="24"/>
+                        </w:rPr>
+                      </w:pPr>
                       <w:r>
                         <w:rPr>
                           <w:rFonts w:ascii="TH Sarabun New" w:hAnsi="TH Sarabun New" w:cs="TH Sarabun New"/>
@@ -4182,7 +4202,24 @@
                           <w:szCs w:val="24"/>
                           <w:cs/>
                         </w:rPr>
-                        <w:t>ชื่อ...............................................กรรมการ</w:t>
+                        <w:t>ชื่อ</w:t>
+                      </w:r>
+                      <w:r>
+                        <w:rPr>
+                          <w:rFonts w:ascii="TH Sarabun New" w:hAnsi="TH Sarabun New" w:cs="TH Sarabun New"/>
+                          <w:sz w:val="24"/>
+                          <w:szCs w:val="24"/>
+                        </w:rPr>
+                        <w:t>………………………………………….</w:t>
+                      </w:r>
+                      <w:r>
+                        <w:rPr>
+                          <w:rFonts w:ascii="TH Sarabun New" w:hAnsi="TH Sarabun New" w:cs="TH Sarabun New"/>
+                          <w:sz w:val="24"/>
+                          <w:szCs w:val="24"/>
+                          <w:cs/>
+                        </w:rPr>
+                        <w:t>กรรมการ</w:t>
                       </w:r>
                     </w:p>
                     <w:p>
@@ -4224,7 +4261,8 @@
                     </w:p>
                   </w:txbxContent>
                 </v:textbox>
-                <w10:wrap anchorx="margin"/>
+                <w10:wrap type="square" anchorx="margin" anchory="page"/>
+                <w10:anchorlock/>
               </v:shape>
             </w:pict>
           </mc:Fallback>
@@ -4237,6 +4275,76 @@
           <w:szCs w:val="20"/>
           <w:cs/>
         </w:rPr>
+        <w:t>๓. ความสามารถด้านการจัดการเรียนการสอน</w:t>
+      </w:r>
+      <w:r>
+        <w:rPr>
+          <w:rFonts w:ascii="TH Sarabun New" w:hAnsi="TH Sarabun New" w:cs="TH Sarabun New"/>
+          <w:sz w:val="20"/>
+          <w:szCs w:val="20"/>
+        </w:rPr>
+        <w:tab/>
+      </w:r>
+      <w:r>
+        <w:rPr>
+          <w:rFonts w:ascii="TH Sarabun New" w:hAnsi="TH Sarabun New" w:cs="TH Sarabun New"/>
+          <w:sz w:val="20"/>
+          <w:szCs w:val="20"/>
+        </w:rPr>
+        <w:tab/>
+      </w:r>
+      <w:r>
+        <w:rPr>
+          <w:rFonts w:ascii="TH Sarabun New" w:hAnsi="TH Sarabun New" w:cs="TH Sarabun New"/>
+          <w:sz w:val="20"/>
+          <w:szCs w:val="20"/>
+        </w:rPr>
+        <w:tab/>
+      </w:r>
+      <w:r>
+        <w:rPr>
+          <w:rFonts w:ascii="TH Sarabun New" w:hAnsi="TH Sarabun New" w:cs="TH Sarabun New"/>
+          <w:sz w:val="20"/>
+          <w:szCs w:val="20"/>
+        </w:rPr>
+        <w:t>{{score3x}}</w:t>
+      </w:r>
+      <w:r>
+        <w:rPr>
+          <w:rFonts w:ascii="TH Sarabun New" w:hAnsi="TH Sarabun New" w:cs="TH Sarabun New" w:hint="cs"/>
+          <w:sz w:val="15"/>
+          <w:szCs w:val="15"/>
+          <w:cs/>
+        </w:rPr>
+        <w:t xml:space="preserve"> </w:t>
+      </w:r>
+      <w:r>
+        <w:rPr>
+          <w:rFonts w:ascii="TH Sarabun New" w:hAnsi="TH Sarabun New" w:cs="TH Sarabun New"/>
+          <w:sz w:val="20"/>
+          <w:szCs w:val="20"/>
+          <w:cs/>
+        </w:rPr>
+        <w:t>คะแนน</w:t>
+      </w:r>
+    </w:p>
+    <w:p>
+      <w:pPr>
+        <w:spacing w:after="0"/>
+        <w:rPr>
+          <w:rFonts w:ascii="TH Sarabun New" w:hAnsi="TH Sarabun New" w:cs="TH Sarabun New"/>
+          <w:sz w:val="20"/>
+          <w:szCs w:val="20"/>
+          <w:cs/>
+        </w:rPr>
+      </w:pPr>
+      <w:r>
+        <w:rPr>
+          <w:rFonts w:ascii="TH Sarabun New" w:hAnsi="TH Sarabun New" w:cs="TH Sarabun New"/>
+          <w:sz w:val="20"/>
+          <w:szCs w:val="20"/>
+          <w:cs/>
+        </w:rPr>
         <w:t>๔. ความเป็นผู้มีคุณธรรมจริยธรรม และวิญญาณความเป็นครู</w:t>
       </w:r>
       <w:r>
@@ -4261,21 +4369,13 @@
           <w:sz w:val="20"/>
           <w:szCs w:val="20"/>
         </w:rPr>
-        <w:tab/>
-      </w:r>
-      <w:r>
-        <w:rPr>
-          <w:rFonts w:ascii="TH Sarabun New" w:hAnsi="TH Sarabun New" w:cs="TH Sarabun New"/>
-          <w:sz w:val="24"/>
-          <w:szCs w:val="24"/>
-        </w:rPr>
         <w:t>{{score4x}}</w:t>
       </w:r>
       <w:r>
         <w:rPr>
           <w:rFonts w:ascii="TH Sarabun New" w:hAnsi="TH Sarabun New" w:cs="TH Sarabun New" w:hint="cs"/>
-          <w:sz w:val="20"/>
-          <w:szCs w:val="20"/>
+          <w:sz w:val="15"/>
+          <w:szCs w:val="15"/>
           <w:cs/>
         </w:rPr>
         <w:t xml:space="preserve"> </w:t>
@@ -4288,15 +4388,6 @@
           <w:cs/>
         </w:rPr>
         <w:t xml:space="preserve">คะแนน </w:t>
-      </w:r>
-      <w:r>
-        <w:rPr>
-          <w:rFonts w:ascii="TH Sarabun New" w:hAnsi="TH Sarabun New" w:cs="TH Sarabun New"/>
-          <w:sz w:val="20"/>
-          <w:szCs w:val="20"/>
-          <w:cs/>
-        </w:rPr>
-        <w:tab/>
       </w:r>
     </w:p>
     <w:p>
@@ -4334,7 +4425,6 @@
           <w:rFonts w:ascii="TH Sarabun New" w:hAnsi="TH Sarabun New" w:cs="TH Sarabun New"/>
           <w:sz w:val="20"/>
           <w:szCs w:val="20"/>
-          <w:cs/>
         </w:rPr>
         <w:tab/>
       </w:r>
@@ -4343,17 +4433,14 @@
           <w:rFonts w:ascii="TH Sarabun New" w:hAnsi="TH Sarabun New" w:cs="TH Sarabun New"/>
           <w:sz w:val="20"/>
           <w:szCs w:val="20"/>
-          <w:cs/>
         </w:rPr>
         <w:tab/>
-        <w:t xml:space="preserve">    </w:t>
-      </w:r>
-      <w:r>
-        <w:rPr>
-          <w:rFonts w:ascii="TH Sarabun New" w:hAnsi="TH Sarabun New" w:cs="TH Sarabun New"/>
-          <w:sz w:val="20"/>
-          <w:szCs w:val="20"/>
-          <w:cs/>
+      </w:r>
+      <w:r>
+        <w:rPr>
+          <w:rFonts w:ascii="TH Sarabun New" w:hAnsi="TH Sarabun New" w:cs="TH Sarabun New"/>
+          <w:sz w:val="20"/>
+          <w:szCs w:val="20"/>
         </w:rPr>
         <w:tab/>
       </w:r>
@@ -4362,7 +4449,6 @@
           <w:rFonts w:ascii="TH Sarabun New" w:hAnsi="TH Sarabun New" w:cs="TH Sarabun New"/>
           <w:sz w:val="20"/>
           <w:szCs w:val="20"/>
-          <w:cs/>
         </w:rPr>
         <w:tab/>
       </w:r>
@@ -4371,50 +4457,14 @@
           <w:rFonts w:ascii="TH Sarabun New" w:hAnsi="TH Sarabun New" w:cs="TH Sarabun New"/>
           <w:sz w:val="20"/>
           <w:szCs w:val="20"/>
-          <w:cs/>
-        </w:rPr>
-        <w:tab/>
-      </w:r>
-      <w:r>
-        <w:rPr>
-          <w:rFonts w:ascii="TH Sarabun New" w:hAnsi="TH Sarabun New" w:cs="TH Sarabun New"/>
-          <w:sz w:val="20"/>
-          <w:szCs w:val="20"/>
-          <w:cs/>
-        </w:rPr>
-        <w:tab/>
-      </w:r>
-      <w:r>
-        <w:rPr>
-          <w:rFonts w:ascii="TH Sarabun New" w:hAnsi="TH Sarabun New" w:cs="TH Sarabun New"/>
-          <w:sz w:val="24"/>
-          <w:szCs w:val="24"/>
-        </w:rPr>
-        <w:t>{{</w:t>
-      </w:r>
-      <w:proofErr w:type="spellStart"/>
-      <w:r>
-        <w:rPr>
-          <w:rFonts w:ascii="TH Sarabun New" w:hAnsi="TH Sarabun New" w:cs="TH Sarabun New"/>
-          <w:sz w:val="24"/>
-          <w:szCs w:val="24"/>
-        </w:rPr>
-        <w:t>scorex</w:t>
-      </w:r>
-      <w:proofErr w:type="spellEnd"/>
-      <w:r>
-        <w:rPr>
-          <w:rFonts w:ascii="TH Sarabun New" w:hAnsi="TH Sarabun New" w:cs="TH Sarabun New"/>
-          <w:sz w:val="24"/>
-          <w:szCs w:val="24"/>
-        </w:rPr>
-        <w:t>}}</w:t>
-      </w:r>
-      <w:r>
-        <w:rPr>
-          <w:rFonts w:ascii="TH Sarabun New" w:hAnsi="TH Sarabun New" w:cs="TH Sarabun New"/>
-          <w:sz w:val="20"/>
-          <w:szCs w:val="20"/>
+        </w:rPr>
+        <w:t>{{scorex}}</w:t>
+      </w:r>
+      <w:r>
+        <w:rPr>
+          <w:rFonts w:ascii="TH Sarabun New" w:hAnsi="TH Sarabun New" w:cs="TH Sarabun New"/>
+          <w:sz w:val="15"/>
+          <w:szCs w:val="15"/>
           <w:cs/>
         </w:rPr>
         <w:t xml:space="preserve"> </w:t>
@@ -4422,20 +4472,28 @@
       <w:r>
         <w:rPr>
           <w:rFonts w:ascii="TH Sarabun New" w:hAnsi="TH Sarabun New" w:cs="TH Sarabun New"/>
+          <w:sz w:val="15"/>
+          <w:szCs w:val="15"/>
+        </w:rPr>
+        <w:t xml:space="preserve"> </w:t>
+      </w:r>
+      <w:r>
+        <w:rPr>
+          <w:rFonts w:ascii="TH Sarabun New" w:hAnsi="TH Sarabun New" w:cs="TH Sarabun New" w:hint="cs"/>
+          <w:sz w:val="15"/>
+          <w:szCs w:val="15"/>
+          <w:cs/>
+        </w:rPr>
+        <w:t xml:space="preserve"> </w:t>
+      </w:r>
+      <w:r>
+        <w:rPr>
+          <w:rFonts w:ascii="TH Sarabun New" w:hAnsi="TH Sarabun New" w:cs="TH Sarabun New"/>
           <w:sz w:val="20"/>
           <w:szCs w:val="20"/>
           <w:cs/>
         </w:rPr>
         <w:t>คะแนน</w:t>
-      </w:r>
-      <w:r>
-        <w:rPr>
-          <w:rFonts w:ascii="TH Sarabun New" w:hAnsi="TH Sarabun New" w:cs="TH Sarabun New"/>
-          <w:sz w:val="20"/>
-          <w:szCs w:val="20"/>
-        </w:rPr>
-        <w:tab/>
-        <w:t xml:space="preserve">      </w:t>
       </w:r>
     </w:p>
     <w:p>
@@ -4460,6 +4518,16 @@
         </w:rPr>
         <w:t>เกณฑ์การประเมิน</w:t>
       </w:r>
+      <w:r>
+        <w:rPr>
+          <w:rFonts w:ascii="TH Sarabun New" w:hAnsi="TH Sarabun New" w:cs="TH Sarabun New"/>
+          <w:b/>
+          <w:bCs/>
+          <w:sz w:val="24"/>
+          <w:szCs w:val="24"/>
+        </w:rPr>
+        <w:t xml:space="preserve">                                                                                                 </w:t>
+      </w:r>
     </w:p>
     <w:p>
       <w:pPr>
@@ -4495,7 +4563,6 @@
           <w:szCs w:val="20"/>
         </w:rPr>
         <w:tab/>
-        <w:t xml:space="preserve">  </w:t>
       </w:r>
     </w:p>
     <w:p>
@@ -4515,24 +4582,24 @@
           <w:szCs w:val="20"/>
           <w:cs/>
         </w:rPr>
-        <w:t xml:space="preserve">ผลรวมค่าน้ำหนักคะแนนที่ได้ เท่ากับ ๕๗-๗๐ ให้ถือว่าผลการสอนอยู่ในระดับ ชำนาญ </w:t>
-      </w:r>
-      <w:r>
-        <w:rPr>
-          <w:rFonts w:ascii="TH Sarabun New" w:hAnsi="TH Sarabun New" w:cs="TH Sarabun New"/>
-          <w:sz w:val="20"/>
-          <w:szCs w:val="20"/>
-        </w:rPr>
-        <w:tab/>
-      </w:r>
-      <w:r>
-        <w:rPr>
-          <w:rFonts w:ascii="TH Sarabun New" w:hAnsi="TH Sarabun New" w:cs="TH Sarabun New"/>
-          <w:sz w:val="20"/>
-          <w:szCs w:val="20"/>
-          <w:cs/>
-        </w:rPr>
-        <w:tab/>
+        <w:t>ผลรวมค่าน้ำหนักคะแนนที่ได้ เท่ากับ ๕๗-๗๐ ให้ถือว่าผลการสอนอยู่ในระดับ ชำนาญ</w:t>
+      </w:r>
+      <w:r>
+        <w:rPr>
+          <w:rFonts w:ascii="TH Sarabun New" w:hAnsi="TH Sarabun New" w:cs="TH Sarabun New" w:hint="cs"/>
+          <w:sz w:val="20"/>
+          <w:szCs w:val="20"/>
+          <w:cs/>
+        </w:rPr>
+        <w:t xml:space="preserve">                               </w:t>
+      </w:r>
+      <w:r>
+        <w:rPr>
+          <w:rFonts w:ascii="TH Sarabun New" w:hAnsi="TH Sarabun New" w:cs="TH Sarabun New"/>
+          <w:sz w:val="20"/>
+          <w:szCs w:val="20"/>
+        </w:rPr>
+        <w:t xml:space="preserve">                     </w:t>
       </w:r>
     </w:p>
     <w:p>
@@ -4553,6 +4620,23 @@
         </w:rPr>
         <w:t xml:space="preserve">ผลรวมค่าน้ำหนักคะแนนที่ได้ เท่ากับ ๗๑-๘๕ ให้ถือว่าผลการสอนอยู่ในระดับ ชำนาญพิเศษ </w:t>
       </w:r>
+      <w:r>
+        <w:rPr>
+          <w:rFonts w:ascii="TH Sarabun New" w:hAnsi="TH Sarabun New" w:cs="TH Sarabun New" w:hint="cs"/>
+          <w:sz w:val="20"/>
+          <w:szCs w:val="20"/>
+          <w:cs/>
+        </w:rPr>
+        <w:t xml:space="preserve">              </w:t>
+      </w:r>
+      <w:r>
+        <w:rPr>
+          <w:rFonts w:ascii="TH Sarabun New" w:hAnsi="TH Sarabun New" w:cs="TH Sarabun New"/>
+          <w:sz w:val="20"/>
+          <w:szCs w:val="20"/>
+        </w:rPr>
+        <w:t xml:space="preserve">                              </w:t>
+      </w:r>
     </w:p>
     <w:p>
       <w:pPr>
@@ -4572,6 +4656,40 @@
         </w:rPr>
         <w:t>ผลรวมค่าน้ำหนักคะแนนที่ได้ เท่ากับ ๘๖-๑๐๐ ให้ถือว่าผลการสอนอยู่ในระดับ เชี่ยวชาญ</w:t>
       </w:r>
+      <w:r>
+        <w:rPr>
+          <w:rFonts w:ascii="TH Sarabun New" w:hAnsi="TH Sarabun New" w:cs="TH Sarabun New" w:hint="cs"/>
+          <w:sz w:val="20"/>
+          <w:szCs w:val="20"/>
+          <w:cs/>
+        </w:rPr>
+        <w:t xml:space="preserve">                       </w:t>
+      </w:r>
+      <w:r>
+        <w:rPr>
+          <w:rFonts w:ascii="TH Sarabun New" w:hAnsi="TH Sarabun New" w:cs="TH Sarabun New"/>
+          <w:sz w:val="20"/>
+          <w:szCs w:val="20"/>
+        </w:rPr>
+        <w:t xml:space="preserve">  </w:t>
+      </w:r>
+      <w:r>
+        <w:rPr>
+          <w:rFonts w:ascii="TH Sarabun New" w:hAnsi="TH Sarabun New" w:cs="TH Sarabun New" w:hint="cs"/>
+          <w:sz w:val="20"/>
+          <w:szCs w:val="20"/>
+          <w:cs/>
+        </w:rPr>
+        <w:t xml:space="preserve"> </w:t>
+      </w:r>
+      <w:r>
+        <w:rPr>
+          <w:rFonts w:ascii="TH Sarabun New" w:hAnsi="TH Sarabun New" w:cs="TH Sarabun New"/>
+          <w:sz w:val="20"/>
+          <w:szCs w:val="20"/>
+        </w:rPr>
+        <w:t xml:space="preserve">                        </w:t>
+      </w:r>
     </w:p>
     <w:p>
       <w:pPr>
@@ -4587,7 +4705,21 @@
           <w:szCs w:val="22"/>
           <w:cs/>
         </w:rPr>
-        <w:t xml:space="preserve">ผู้ช่วยศาสตราจารย์ ต้องมีผลการประเมินไม่ต่ำกว่าระดับชำนาญรองศาสตราจารย์ </w:t>
+        <w:t>ผู้ช่วยศาสตราจารย์ ต้องมีผลการประเมินไม่ต่ำกว่าระดับชำนาญรองศาสตราจารย์</w:t>
+      </w:r>
+      <w:r>
+        <w:rPr>
+          <w:rFonts w:ascii="TH Sarabun New" w:hAnsi="TH Sarabun New" w:cs="TH Sarabun New"/>
+          <w:szCs w:val="22"/>
+        </w:rPr>
+        <w:t xml:space="preserve">                </w:t>
+      </w:r>
+      <w:r>
+        <w:rPr>
+          <w:rFonts w:ascii="TH Sarabun New" w:hAnsi="TH Sarabun New" w:cs="TH Sarabun New"/>
+          <w:szCs w:val="22"/>
+        </w:rPr>
+        <w:t xml:space="preserve">                              </w:t>
       </w:r>
     </w:p>
     <w:p>
@@ -4605,6 +4737,13 @@
           <w:cs/>
         </w:rPr>
         <w:t>ต้องมีผลการประเมินไม่ต่ำกว่าระดับชำนาญพิเศษ</w:t>
+      </w:r>
+      <w:r>
+        <w:rPr>
+          <w:rFonts w:ascii="TH Sarabun New" w:hAnsi="TH Sarabun New" w:cs="TH Sarabun New"/>
+          <w:szCs w:val="22"/>
+        </w:rPr>
+        <w:t xml:space="preserve">                                                                                                       </w:t>
       </w:r>
     </w:p>
     <w:sectPr>
@@ -4690,7 +4829,7 @@
     <w:sdtContent>
       <w:p>
         <w:pPr>
-          <w:pStyle w:val="a4"/>
+          <w:pStyle w:val="Header"/>
           <w:jc w:val="center"/>
           <w:rPr>
             <w:rFonts w:ascii="TH Sarabun New" w:hAnsi="TH Sarabun New" w:cs="TH Sarabun New"/>
@@ -5513,18 +5652,18 @@
     <w:lsdException w:name="Unresolved Mention" w:semiHidden="1" w:unhideWhenUsed="1"/>
     <w:lsdException w:name="Smart Link" w:semiHidden="1" w:unhideWhenUsed="1"/>
   </w:latentStyles>
-  <w:style w:type="paragraph" w:default="1" w:styleId="a">
+  <w:style w:type="paragraph" w:default="1" w:styleId="Normal">
     <w:name w:val="Normal"/>
     <w:qFormat/>
     <w:rsid w:val="008C0D0C"/>
   </w:style>
-  <w:style w:type="character" w:default="1" w:styleId="a0">
+  <w:style w:type="character" w:default="1" w:styleId="DefaultParagraphFont">
     <w:name w:val="Default Paragraph Font"/>
     <w:uiPriority w:val="1"/>
     <w:semiHidden/>
     <w:unhideWhenUsed/>
   </w:style>
-  <w:style w:type="table" w:default="1" w:styleId="a1">
+  <w:style w:type="table" w:default="1" w:styleId="TableNormal">
     <w:name w:val="Normal Table"/>
     <w:uiPriority w:val="99"/>
     <w:semiHidden/>
@@ -5539,15 +5678,15 @@
       </w:tblCellMar>
     </w:tblPr>
   </w:style>
-  <w:style w:type="numbering" w:default="1" w:styleId="a2">
+  <w:style w:type="numbering" w:default="1" w:styleId="NoList">
     <w:name w:val="No List"/>
     <w:uiPriority w:val="99"/>
     <w:semiHidden/>
     <w:unhideWhenUsed/>
   </w:style>
-  <w:style w:type="paragraph" w:styleId="a3">
+  <w:style w:type="paragraph" w:styleId="ListParagraph">
     <w:name w:val="List Paragraph"/>
-    <w:basedOn w:val="a"/>
+    <w:basedOn w:val="Normal"/>
     <w:uiPriority w:val="34"/>
     <w:qFormat/>
     <w:rsid w:val="008C0D0C"/>
@@ -5556,10 +5695,10 @@
       <w:contextualSpacing/>
     </w:pPr>
   </w:style>
-  <w:style w:type="paragraph" w:styleId="a4">
+  <w:style w:type="paragraph" w:styleId="Header">
     <w:name w:val="header"/>
-    <w:basedOn w:val="a"/>
-    <w:link w:val="a5"/>
+    <w:basedOn w:val="Normal"/>
+    <w:link w:val="HeaderChar"/>
     <w:uiPriority w:val="99"/>
     <w:unhideWhenUsed/>
     <w:rsid w:val="00BE4789"/>
@@ -5571,17 +5710,17 @@
       <w:spacing w:after="0" w:line="240" w:lineRule="auto"/>
     </w:pPr>
   </w:style>
-  <w:style w:type="character" w:customStyle="1" w:styleId="a5">
-    <w:name w:val="หัวกระดาษ อักขระ"/>
-    <w:basedOn w:val="a0"/>
-    <w:link w:val="a4"/>
+  <w:style w:type="character" w:customStyle="1" w:styleId="HeaderChar">
+    <w:name w:val="Header Char"/>
+    <w:basedOn w:val="DefaultParagraphFont"/>
+    <w:link w:val="Header"/>
     <w:uiPriority w:val="99"/>
     <w:rsid w:val="00BE4789"/>
   </w:style>
-  <w:style w:type="paragraph" w:styleId="a6">
+  <w:style w:type="paragraph" w:styleId="Footer">
     <w:name w:val="footer"/>
-    <w:basedOn w:val="a"/>
-    <w:link w:val="a7"/>
+    <w:basedOn w:val="Normal"/>
+    <w:link w:val="FooterChar"/>
     <w:uiPriority w:val="99"/>
     <w:unhideWhenUsed/>
     <w:rsid w:val="00BE4789"/>
@@ -5593,10 +5732,10 @@
       <w:spacing w:after="0" w:line="240" w:lineRule="auto"/>
     </w:pPr>
   </w:style>
-  <w:style w:type="character" w:customStyle="1" w:styleId="a7">
-    <w:name w:val="ท้ายกระดาษ อักขระ"/>
-    <w:basedOn w:val="a0"/>
-    <w:link w:val="a6"/>
+  <w:style w:type="character" w:customStyle="1" w:styleId="FooterChar">
+    <w:name w:val="Footer Char"/>
+    <w:basedOn w:val="DefaultParagraphFont"/>
+    <w:link w:val="Footer"/>
     <w:uiPriority w:val="99"/>
     <w:rsid w:val="00BE4789"/>
   </w:style>

</xml_diff>